<commit_message>
chore: change document file
</commit_message>
<xml_diff>
--- a/Plan.docx
+++ b/Plan.docx
@@ -8,16 +8,14 @@
         <w:outlineLvl w:val="2"/>
         <w:rPr>
           <w:rFonts w:ascii="Times New Roman" w:eastAsia="Times New Roman" w:hAnsi="Times New Roman" w:cs="Times New Roman"/>
-          <w:color w:val="2E74B5" w:themeColor="accent5" w:themeShade="BF"/>
-          <w:kern w:val="0"/>
-          <w:lang w:bidi="th-TH"/>
-          <w14:ligatures w14:val="none"/>
-        </w:rPr>
-      </w:pPr>
-      <w:r>
-        <w:rPr>
-          <w:rFonts w:ascii="Times New Roman" w:eastAsia="Times New Roman" w:hAnsi="Times New Roman" w:cs="Times New Roman"/>
-          <w:color w:val="2E74B5" w:themeColor="accent5" w:themeShade="BF"/>
+          <w:kern w:val="0"/>
+          <w:lang w:bidi="th-TH"/>
+          <w14:ligatures w14:val="none"/>
+        </w:rPr>
+      </w:pPr>
+      <w:r>
+        <w:rPr>
+          <w:rFonts w:ascii="Times New Roman" w:eastAsia="Times New Roman" w:hAnsi="Times New Roman" w:cs="Times New Roman"/>
           <w:kern w:val="0"/>
           <w:lang w:bidi="th-TH"/>
           <w14:ligatures w14:val="none"/>
@@ -28,7 +26,6 @@
       <w:r>
         <w:rPr>
           <w:rFonts w:ascii="Times New Roman" w:eastAsia="Times New Roman" w:hAnsi="Times New Roman" w:cs="Times New Roman"/>
-          <w:color w:val="2E74B5" w:themeColor="accent5" w:themeShade="BF"/>
           <w:kern w:val="0"/>
           <w:lang w:bidi="th-TH"/>
           <w14:ligatures w14:val="none"/>
@@ -39,7 +36,6 @@
       <w:r>
         <w:rPr>
           <w:rFonts w:ascii="Times New Roman" w:eastAsia="Times New Roman" w:hAnsi="Times New Roman" w:cs="Times New Roman"/>
-          <w:color w:val="2E74B5" w:themeColor="accent5" w:themeShade="BF"/>
           <w:kern w:val="0"/>
           <w:lang w:bidi="th-TH"/>
           <w14:ligatures w14:val="none"/>
@@ -50,7 +46,6 @@
       <w:r>
         <w:rPr>
           <w:rFonts w:ascii="Times New Roman" w:eastAsia="Times New Roman" w:hAnsi="Times New Roman" w:cs="Times New Roman"/>
-          <w:color w:val="2E74B5" w:themeColor="accent5" w:themeShade="BF"/>
           <w:kern w:val="0"/>
           <w:lang w:bidi="th-TH"/>
           <w14:ligatures w14:val="none"/>
@@ -61,18 +56,16 @@
       <w:r>
         <w:rPr>
           <w:rFonts w:ascii="Times New Roman" w:eastAsia="Times New Roman" w:hAnsi="Times New Roman" w:cs="Times New Roman"/>
-          <w:color w:val="2E74B5" w:themeColor="accent5" w:themeShade="BF"/>
-          <w:kern w:val="0"/>
-          <w:lang w:bidi="th-TH"/>
-          <w14:ligatures w14:val="none"/>
-        </w:rPr>
-        <w:t xml:space="preserve"> </w:t>
-      </w:r>
-      <w:proofErr w:type="spellStart"/>
-      <w:r>
-        <w:rPr>
-          <w:rFonts w:ascii="Times New Roman" w:eastAsia="Times New Roman" w:hAnsi="Times New Roman" w:cs="Times New Roman"/>
-          <w:color w:val="2E74B5" w:themeColor="accent5" w:themeShade="BF"/>
+          <w:kern w:val="0"/>
+          <w:lang w:bidi="th-TH"/>
+          <w14:ligatures w14:val="none"/>
+        </w:rPr>
+        <w:t xml:space="preserve"> </w:t>
+      </w:r>
+      <w:proofErr w:type="spellStart"/>
+      <w:r>
+        <w:rPr>
+          <w:rFonts w:ascii="Times New Roman" w:eastAsia="Times New Roman" w:hAnsi="Times New Roman" w:cs="Times New Roman"/>
           <w:kern w:val="0"/>
           <w:lang w:bidi="th-TH"/>
           <w14:ligatures w14:val="none"/>
@@ -83,18 +76,16 @@
       <w:r>
         <w:rPr>
           <w:rFonts w:ascii="Times New Roman" w:eastAsia="Times New Roman" w:hAnsi="Times New Roman" w:cs="Times New Roman"/>
-          <w:color w:val="2E74B5" w:themeColor="accent5" w:themeShade="BF"/>
-          <w:kern w:val="0"/>
-          <w:lang w:bidi="th-TH"/>
-          <w14:ligatures w14:val="none"/>
-        </w:rPr>
-        <w:t xml:space="preserve"> </w:t>
-      </w:r>
-      <w:proofErr w:type="spellStart"/>
-      <w:r>
-        <w:rPr>
-          <w:rFonts w:ascii="Times New Roman" w:eastAsia="Times New Roman" w:hAnsi="Times New Roman" w:cs="Times New Roman"/>
-          <w:color w:val="2E74B5" w:themeColor="accent5" w:themeShade="BF"/>
+          <w:kern w:val="0"/>
+          <w:lang w:bidi="th-TH"/>
+          <w14:ligatures w14:val="none"/>
+        </w:rPr>
+        <w:t xml:space="preserve"> </w:t>
+      </w:r>
+      <w:proofErr w:type="spellStart"/>
+      <w:r>
+        <w:rPr>
+          <w:rFonts w:ascii="Times New Roman" w:eastAsia="Times New Roman" w:hAnsi="Times New Roman" w:cs="Times New Roman"/>
           <w:kern w:val="0"/>
           <w:lang w:bidi="th-TH"/>
           <w14:ligatures w14:val="none"/>
@@ -105,18 +96,16 @@
       <w:r>
         <w:rPr>
           <w:rFonts w:ascii="Times New Roman" w:eastAsia="Times New Roman" w:hAnsi="Times New Roman" w:cs="Times New Roman"/>
-          <w:color w:val="2E74B5" w:themeColor="accent5" w:themeShade="BF"/>
-          <w:kern w:val="0"/>
-          <w:lang w:bidi="th-TH"/>
-          <w14:ligatures w14:val="none"/>
-        </w:rPr>
-        <w:t xml:space="preserve"> </w:t>
-      </w:r>
-      <w:proofErr w:type="spellStart"/>
-      <w:r>
-        <w:rPr>
-          <w:rFonts w:ascii="Times New Roman" w:eastAsia="Times New Roman" w:hAnsi="Times New Roman" w:cs="Times New Roman"/>
-          <w:color w:val="2E74B5" w:themeColor="accent5" w:themeShade="BF"/>
+          <w:kern w:val="0"/>
+          <w:lang w:bidi="th-TH"/>
+          <w14:ligatures w14:val="none"/>
+        </w:rPr>
+        <w:t xml:space="preserve"> </w:t>
+      </w:r>
+      <w:proofErr w:type="spellStart"/>
+      <w:r>
+        <w:rPr>
+          <w:rFonts w:ascii="Times New Roman" w:eastAsia="Times New Roman" w:hAnsi="Times New Roman" w:cs="Times New Roman"/>
           <w:kern w:val="0"/>
           <w:lang w:bidi="th-TH"/>
           <w14:ligatures w14:val="none"/>
@@ -127,7 +116,6 @@
       <w:r>
         <w:rPr>
           <w:rFonts w:ascii="Times New Roman" w:eastAsia="Times New Roman" w:hAnsi="Times New Roman" w:cs="Times New Roman"/>
-          <w:color w:val="2E74B5" w:themeColor="accent5" w:themeShade="BF"/>
           <w:kern w:val="0"/>
           <w:lang w:bidi="th-TH"/>
           <w14:ligatures w14:val="none"/>
@@ -138,7 +126,6 @@
       <w:r>
         <w:rPr>
           <w:rFonts w:ascii="Times New Roman" w:eastAsia="Times New Roman" w:hAnsi="Times New Roman" w:cs="Times New Roman"/>
-          <w:color w:val="2E74B5" w:themeColor="accent5" w:themeShade="BF"/>
           <w:kern w:val="0"/>
           <w:lang w:bidi="th-TH"/>
           <w14:ligatures w14:val="none"/>
@@ -149,18 +136,16 @@
       <w:r>
         <w:rPr>
           <w:rFonts w:ascii="Times New Roman" w:eastAsia="Times New Roman" w:hAnsi="Times New Roman" w:cs="Times New Roman"/>
-          <w:color w:val="2E74B5" w:themeColor="accent5" w:themeShade="BF"/>
-          <w:kern w:val="0"/>
-          <w:lang w:bidi="th-TH"/>
-          <w14:ligatures w14:val="none"/>
-        </w:rPr>
-        <w:t xml:space="preserve"> </w:t>
-      </w:r>
-      <w:proofErr w:type="spellStart"/>
-      <w:r>
-        <w:rPr>
-          <w:rFonts w:ascii="Times New Roman" w:eastAsia="Times New Roman" w:hAnsi="Times New Roman" w:cs="Times New Roman"/>
-          <w:color w:val="2E74B5" w:themeColor="accent5" w:themeShade="BF"/>
+          <w:kern w:val="0"/>
+          <w:lang w:bidi="th-TH"/>
+          <w14:ligatures w14:val="none"/>
+        </w:rPr>
+        <w:t xml:space="preserve"> </w:t>
+      </w:r>
+      <w:proofErr w:type="spellStart"/>
+      <w:r>
+        <w:rPr>
+          <w:rFonts w:ascii="Times New Roman" w:eastAsia="Times New Roman" w:hAnsi="Times New Roman" w:cs="Times New Roman"/>
           <w:kern w:val="0"/>
           <w:lang w:bidi="th-TH"/>
           <w14:ligatures w14:val="none"/>
@@ -171,18 +156,16 @@
       <w:r>
         <w:rPr>
           <w:rFonts w:ascii="Times New Roman" w:eastAsia="Times New Roman" w:hAnsi="Times New Roman" w:cs="Times New Roman"/>
-          <w:color w:val="2E74B5" w:themeColor="accent5" w:themeShade="BF"/>
-          <w:kern w:val="0"/>
-          <w:lang w:bidi="th-TH"/>
-          <w14:ligatures w14:val="none"/>
-        </w:rPr>
-        <w:t xml:space="preserve"> </w:t>
-      </w:r>
-      <w:proofErr w:type="spellStart"/>
-      <w:r>
-        <w:rPr>
-          <w:rFonts w:ascii="Times New Roman" w:eastAsia="Times New Roman" w:hAnsi="Times New Roman" w:cs="Times New Roman"/>
-          <w:color w:val="2E74B5" w:themeColor="accent5" w:themeShade="BF"/>
+          <w:kern w:val="0"/>
+          <w:lang w:bidi="th-TH"/>
+          <w14:ligatures w14:val="none"/>
+        </w:rPr>
+        <w:t xml:space="preserve"> </w:t>
+      </w:r>
+      <w:proofErr w:type="spellStart"/>
+      <w:r>
+        <w:rPr>
+          <w:rFonts w:ascii="Times New Roman" w:eastAsia="Times New Roman" w:hAnsi="Times New Roman" w:cs="Times New Roman"/>
           <w:kern w:val="0"/>
           <w:lang w:bidi="th-TH"/>
           <w14:ligatures w14:val="none"/>
@@ -193,18 +176,16 @@
       <w:r>
         <w:rPr>
           <w:rFonts w:ascii="Times New Roman" w:eastAsia="Times New Roman" w:hAnsi="Times New Roman" w:cs="Times New Roman"/>
-          <w:color w:val="2E74B5" w:themeColor="accent5" w:themeShade="BF"/>
-          <w:kern w:val="0"/>
-          <w:lang w:bidi="th-TH"/>
-          <w14:ligatures w14:val="none"/>
-        </w:rPr>
-        <w:t xml:space="preserve"> </w:t>
-      </w:r>
-      <w:proofErr w:type="spellStart"/>
-      <w:r>
-        <w:rPr>
-          <w:rFonts w:ascii="Times New Roman" w:eastAsia="Times New Roman" w:hAnsi="Times New Roman" w:cs="Times New Roman"/>
-          <w:color w:val="2E74B5" w:themeColor="accent5" w:themeShade="BF"/>
+          <w:kern w:val="0"/>
+          <w:lang w:bidi="th-TH"/>
+          <w14:ligatures w14:val="none"/>
+        </w:rPr>
+        <w:t xml:space="preserve"> </w:t>
+      </w:r>
+      <w:proofErr w:type="spellStart"/>
+      <w:r>
+        <w:rPr>
+          <w:rFonts w:ascii="Times New Roman" w:eastAsia="Times New Roman" w:hAnsi="Times New Roman" w:cs="Times New Roman"/>
           <w:kern w:val="0"/>
           <w:lang w:bidi="th-TH"/>
           <w14:ligatures w14:val="none"/>
@@ -215,7 +196,6 @@
       <w:r>
         <w:rPr>
           <w:rFonts w:ascii="Times New Roman" w:eastAsia="Times New Roman" w:hAnsi="Times New Roman" w:cs="Times New Roman"/>
-          <w:color w:val="2E74B5" w:themeColor="accent5" w:themeShade="BF"/>
           <w:kern w:val="0"/>
           <w:lang w:bidi="th-TH"/>
           <w14:ligatures w14:val="none"/>
@@ -228,17 +208,15 @@
         <w:spacing w:after="150" w:line="240" w:lineRule="auto"/>
         <w:rPr>
           <w:rFonts w:ascii="Times New Roman" w:eastAsia="Times New Roman" w:hAnsi="Times New Roman" w:cs="Times New Roman"/>
-          <w:color w:val="2E74B5" w:themeColor="accent5" w:themeShade="BF"/>
-          <w:kern w:val="0"/>
-          <w:lang w:bidi="th-TH"/>
-          <w14:ligatures w14:val="none"/>
-        </w:rPr>
-      </w:pPr>
-      <w:proofErr w:type="spellStart"/>
-      <w:r>
-        <w:rPr>
-          <w:rFonts w:ascii="Times New Roman" w:eastAsia="Times New Roman" w:hAnsi="Times New Roman" w:cs="Times New Roman"/>
-          <w:color w:val="2E74B5" w:themeColor="accent5" w:themeShade="BF"/>
+          <w:kern w:val="0"/>
+          <w:lang w:bidi="th-TH"/>
+          <w14:ligatures w14:val="none"/>
+        </w:rPr>
+      </w:pPr>
+      <w:proofErr w:type="spellStart"/>
+      <w:r>
+        <w:rPr>
+          <w:rFonts w:ascii="Times New Roman" w:eastAsia="Times New Roman" w:hAnsi="Times New Roman" w:cs="Times New Roman"/>
           <w:kern w:val="0"/>
           <w:lang w:bidi="th-TH"/>
           <w14:ligatures w14:val="none"/>
@@ -249,18 +227,16 @@
       <w:r>
         <w:rPr>
           <w:rFonts w:ascii="Times New Roman" w:eastAsia="Times New Roman" w:hAnsi="Times New Roman" w:cs="Times New Roman"/>
-          <w:color w:val="2E74B5" w:themeColor="accent5" w:themeShade="BF"/>
-          <w:kern w:val="0"/>
-          <w:lang w:bidi="th-TH"/>
-          <w14:ligatures w14:val="none"/>
-        </w:rPr>
-        <w:t xml:space="preserve"> </w:t>
-      </w:r>
-      <w:proofErr w:type="spellStart"/>
-      <w:r>
-        <w:rPr>
-          <w:rFonts w:ascii="Times New Roman" w:eastAsia="Times New Roman" w:hAnsi="Times New Roman" w:cs="Times New Roman"/>
-          <w:color w:val="2E74B5" w:themeColor="accent5" w:themeShade="BF"/>
+          <w:kern w:val="0"/>
+          <w:lang w:bidi="th-TH"/>
+          <w14:ligatures w14:val="none"/>
+        </w:rPr>
+        <w:t xml:space="preserve"> </w:t>
+      </w:r>
+      <w:proofErr w:type="spellStart"/>
+      <w:r>
+        <w:rPr>
+          <w:rFonts w:ascii="Times New Roman" w:eastAsia="Times New Roman" w:hAnsi="Times New Roman" w:cs="Times New Roman"/>
           <w:kern w:val="0"/>
           <w:lang w:bidi="th-TH"/>
           <w14:ligatures w14:val="none"/>
@@ -271,7 +247,6 @@
       <w:r>
         <w:rPr>
           <w:rFonts w:ascii="Times New Roman" w:eastAsia="Times New Roman" w:hAnsi="Times New Roman" w:cs="Times New Roman"/>
-          <w:color w:val="2E74B5" w:themeColor="accent5" w:themeShade="BF"/>
           <w:kern w:val="0"/>
           <w:lang w:bidi="th-TH"/>
           <w14:ligatures w14:val="none"/>
@@ -282,7 +257,6 @@
       <w:r>
         <w:rPr>
           <w:rFonts w:ascii="Times New Roman" w:eastAsia="Times New Roman" w:hAnsi="Times New Roman" w:cs="Times New Roman"/>
-          <w:color w:val="2E74B5" w:themeColor="accent5" w:themeShade="BF"/>
           <w:kern w:val="0"/>
           <w:lang w:bidi="th-TH"/>
           <w14:ligatures w14:val="none"/>
@@ -293,18 +267,16 @@
       <w:r>
         <w:rPr>
           <w:rFonts w:ascii="Times New Roman" w:eastAsia="Times New Roman" w:hAnsi="Times New Roman" w:cs="Times New Roman"/>
-          <w:color w:val="2E74B5" w:themeColor="accent5" w:themeShade="BF"/>
-          <w:kern w:val="0"/>
-          <w:lang w:bidi="th-TH"/>
-          <w14:ligatures w14:val="none"/>
-        </w:rPr>
-        <w:t xml:space="preserve"> </w:t>
-      </w:r>
-      <w:proofErr w:type="spellStart"/>
-      <w:r>
-        <w:rPr>
-          <w:rFonts w:ascii="Times New Roman" w:eastAsia="Times New Roman" w:hAnsi="Times New Roman" w:cs="Times New Roman"/>
-          <w:color w:val="2E74B5" w:themeColor="accent5" w:themeShade="BF"/>
+          <w:kern w:val="0"/>
+          <w:lang w:bidi="th-TH"/>
+          <w14:ligatures w14:val="none"/>
+        </w:rPr>
+        <w:t xml:space="preserve"> </w:t>
+      </w:r>
+      <w:proofErr w:type="spellStart"/>
+      <w:r>
+        <w:rPr>
+          <w:rFonts w:ascii="Times New Roman" w:eastAsia="Times New Roman" w:hAnsi="Times New Roman" w:cs="Times New Roman"/>
           <w:kern w:val="0"/>
           <w:lang w:bidi="th-TH"/>
           <w14:ligatures w14:val="none"/>
@@ -315,18 +287,16 @@
       <w:r>
         <w:rPr>
           <w:rFonts w:ascii="Times New Roman" w:eastAsia="Times New Roman" w:hAnsi="Times New Roman" w:cs="Times New Roman"/>
-          <w:color w:val="2E74B5" w:themeColor="accent5" w:themeShade="BF"/>
-          <w:kern w:val="0"/>
-          <w:lang w:bidi="th-TH"/>
-          <w14:ligatures w14:val="none"/>
-        </w:rPr>
-        <w:t xml:space="preserve"> </w:t>
-      </w:r>
-      <w:proofErr w:type="spellStart"/>
-      <w:r>
-        <w:rPr>
-          <w:rFonts w:ascii="Times New Roman" w:eastAsia="Times New Roman" w:hAnsi="Times New Roman" w:cs="Times New Roman"/>
-          <w:color w:val="2E74B5" w:themeColor="accent5" w:themeShade="BF"/>
+          <w:kern w:val="0"/>
+          <w:lang w:bidi="th-TH"/>
+          <w14:ligatures w14:val="none"/>
+        </w:rPr>
+        <w:t xml:space="preserve"> </w:t>
+      </w:r>
+      <w:proofErr w:type="spellStart"/>
+      <w:r>
+        <w:rPr>
+          <w:rFonts w:ascii="Times New Roman" w:eastAsia="Times New Roman" w:hAnsi="Times New Roman" w:cs="Times New Roman"/>
           <w:kern w:val="0"/>
           <w:lang w:bidi="th-TH"/>
           <w14:ligatures w14:val="none"/>
@@ -337,18 +307,16 @@
       <w:r>
         <w:rPr>
           <w:rFonts w:ascii="Times New Roman" w:eastAsia="Times New Roman" w:hAnsi="Times New Roman" w:cs="Times New Roman"/>
-          <w:color w:val="2E74B5" w:themeColor="accent5" w:themeShade="BF"/>
-          <w:kern w:val="0"/>
-          <w:lang w:bidi="th-TH"/>
-          <w14:ligatures w14:val="none"/>
-        </w:rPr>
-        <w:t xml:space="preserve"> </w:t>
-      </w:r>
-      <w:proofErr w:type="spellStart"/>
-      <w:r>
-        <w:rPr>
-          <w:rFonts w:ascii="Times New Roman" w:eastAsia="Times New Roman" w:hAnsi="Times New Roman" w:cs="Times New Roman"/>
-          <w:color w:val="2E74B5" w:themeColor="accent5" w:themeShade="BF"/>
+          <w:kern w:val="0"/>
+          <w:lang w:bidi="th-TH"/>
+          <w14:ligatures w14:val="none"/>
+        </w:rPr>
+        <w:t xml:space="preserve"> </w:t>
+      </w:r>
+      <w:proofErr w:type="spellStart"/>
+      <w:r>
+        <w:rPr>
+          <w:rFonts w:ascii="Times New Roman" w:eastAsia="Times New Roman" w:hAnsi="Times New Roman" w:cs="Times New Roman"/>
           <w:kern w:val="0"/>
           <w:lang w:bidi="th-TH"/>
           <w14:ligatures w14:val="none"/>
@@ -359,18 +327,16 @@
       <w:r>
         <w:rPr>
           <w:rFonts w:ascii="Times New Roman" w:eastAsia="Times New Roman" w:hAnsi="Times New Roman" w:cs="Times New Roman"/>
-          <w:color w:val="2E74B5" w:themeColor="accent5" w:themeShade="BF"/>
-          <w:kern w:val="0"/>
-          <w:lang w:bidi="th-TH"/>
-          <w14:ligatures w14:val="none"/>
-        </w:rPr>
-        <w:t xml:space="preserve"> </w:t>
-      </w:r>
-      <w:proofErr w:type="spellStart"/>
-      <w:r>
-        <w:rPr>
-          <w:rFonts w:ascii="Times New Roman" w:eastAsia="Times New Roman" w:hAnsi="Times New Roman" w:cs="Times New Roman"/>
-          <w:color w:val="2E74B5" w:themeColor="accent5" w:themeShade="BF"/>
+          <w:kern w:val="0"/>
+          <w:lang w:bidi="th-TH"/>
+          <w14:ligatures w14:val="none"/>
+        </w:rPr>
+        <w:t xml:space="preserve"> </w:t>
+      </w:r>
+      <w:proofErr w:type="spellStart"/>
+      <w:r>
+        <w:rPr>
+          <w:rFonts w:ascii="Times New Roman" w:eastAsia="Times New Roman" w:hAnsi="Times New Roman" w:cs="Times New Roman"/>
           <w:kern w:val="0"/>
           <w:lang w:bidi="th-TH"/>
           <w14:ligatures w14:val="none"/>
@@ -381,18 +347,16 @@
       <w:r>
         <w:rPr>
           <w:rFonts w:ascii="Times New Roman" w:eastAsia="Times New Roman" w:hAnsi="Times New Roman" w:cs="Times New Roman"/>
-          <w:color w:val="2E74B5" w:themeColor="accent5" w:themeShade="BF"/>
-          <w:kern w:val="0"/>
-          <w:lang w:bidi="th-TH"/>
-          <w14:ligatures w14:val="none"/>
-        </w:rPr>
-        <w:t xml:space="preserve"> </w:t>
-      </w:r>
-      <w:proofErr w:type="spellStart"/>
-      <w:r>
-        <w:rPr>
-          <w:rFonts w:ascii="Times New Roman" w:eastAsia="Times New Roman" w:hAnsi="Times New Roman" w:cs="Times New Roman"/>
-          <w:color w:val="2E74B5" w:themeColor="accent5" w:themeShade="BF"/>
+          <w:kern w:val="0"/>
+          <w:lang w:bidi="th-TH"/>
+          <w14:ligatures w14:val="none"/>
+        </w:rPr>
+        <w:t xml:space="preserve"> </w:t>
+      </w:r>
+      <w:proofErr w:type="spellStart"/>
+      <w:r>
+        <w:rPr>
+          <w:rFonts w:ascii="Times New Roman" w:eastAsia="Times New Roman" w:hAnsi="Times New Roman" w:cs="Times New Roman"/>
           <w:kern w:val="0"/>
           <w:lang w:bidi="th-TH"/>
           <w14:ligatures w14:val="none"/>
@@ -403,18 +367,16 @@
       <w:r>
         <w:rPr>
           <w:rFonts w:ascii="Times New Roman" w:eastAsia="Times New Roman" w:hAnsi="Times New Roman" w:cs="Times New Roman"/>
-          <w:color w:val="2E74B5" w:themeColor="accent5" w:themeShade="BF"/>
-          <w:kern w:val="0"/>
-          <w:lang w:bidi="th-TH"/>
-          <w14:ligatures w14:val="none"/>
-        </w:rPr>
-        <w:t xml:space="preserve"> </w:t>
-      </w:r>
-      <w:proofErr w:type="spellStart"/>
-      <w:r>
-        <w:rPr>
-          <w:rFonts w:ascii="Times New Roman" w:eastAsia="Times New Roman" w:hAnsi="Times New Roman" w:cs="Times New Roman"/>
-          <w:color w:val="2E74B5" w:themeColor="accent5" w:themeShade="BF"/>
+          <w:kern w:val="0"/>
+          <w:lang w:bidi="th-TH"/>
+          <w14:ligatures w14:val="none"/>
+        </w:rPr>
+        <w:t xml:space="preserve"> </w:t>
+      </w:r>
+      <w:proofErr w:type="spellStart"/>
+      <w:r>
+        <w:rPr>
+          <w:rFonts w:ascii="Times New Roman" w:eastAsia="Times New Roman" w:hAnsi="Times New Roman" w:cs="Times New Roman"/>
           <w:kern w:val="0"/>
           <w:lang w:bidi="th-TH"/>
           <w14:ligatures w14:val="none"/>
@@ -425,18 +387,16 @@
       <w:r>
         <w:rPr>
           <w:rFonts w:ascii="Times New Roman" w:eastAsia="Times New Roman" w:hAnsi="Times New Roman" w:cs="Times New Roman"/>
-          <w:color w:val="2E74B5" w:themeColor="accent5" w:themeShade="BF"/>
-          <w:kern w:val="0"/>
-          <w:lang w:bidi="th-TH"/>
-          <w14:ligatures w14:val="none"/>
-        </w:rPr>
-        <w:t xml:space="preserve"> </w:t>
-      </w:r>
-      <w:proofErr w:type="spellStart"/>
-      <w:r>
-        <w:rPr>
-          <w:rFonts w:ascii="Times New Roman" w:eastAsia="Times New Roman" w:hAnsi="Times New Roman" w:cs="Times New Roman"/>
-          <w:color w:val="2E74B5" w:themeColor="accent5" w:themeShade="BF"/>
+          <w:kern w:val="0"/>
+          <w:lang w:bidi="th-TH"/>
+          <w14:ligatures w14:val="none"/>
+        </w:rPr>
+        <w:t xml:space="preserve"> </w:t>
+      </w:r>
+      <w:proofErr w:type="spellStart"/>
+      <w:r>
+        <w:rPr>
+          <w:rFonts w:ascii="Times New Roman" w:eastAsia="Times New Roman" w:hAnsi="Times New Roman" w:cs="Times New Roman"/>
           <w:kern w:val="0"/>
           <w:lang w:bidi="th-TH"/>
           <w14:ligatures w14:val="none"/>
@@ -447,18 +407,16 @@
       <w:r>
         <w:rPr>
           <w:rFonts w:ascii="Times New Roman" w:eastAsia="Times New Roman" w:hAnsi="Times New Roman" w:cs="Times New Roman"/>
-          <w:color w:val="2E74B5" w:themeColor="accent5" w:themeShade="BF"/>
-          <w:kern w:val="0"/>
-          <w:lang w:bidi="th-TH"/>
-          <w14:ligatures w14:val="none"/>
-        </w:rPr>
-        <w:t xml:space="preserve"> </w:t>
-      </w:r>
-      <w:proofErr w:type="spellStart"/>
-      <w:r>
-        <w:rPr>
-          <w:rFonts w:ascii="Times New Roman" w:eastAsia="Times New Roman" w:hAnsi="Times New Roman" w:cs="Times New Roman"/>
-          <w:color w:val="2E74B5" w:themeColor="accent5" w:themeShade="BF"/>
+          <w:kern w:val="0"/>
+          <w:lang w:bidi="th-TH"/>
+          <w14:ligatures w14:val="none"/>
+        </w:rPr>
+        <w:t xml:space="preserve"> </w:t>
+      </w:r>
+      <w:proofErr w:type="spellStart"/>
+      <w:r>
+        <w:rPr>
+          <w:rFonts w:ascii="Times New Roman" w:eastAsia="Times New Roman" w:hAnsi="Times New Roman" w:cs="Times New Roman"/>
           <w:kern w:val="0"/>
           <w:lang w:bidi="th-TH"/>
           <w14:ligatures w14:val="none"/>
@@ -469,18 +427,16 @@
       <w:r>
         <w:rPr>
           <w:rFonts w:ascii="Times New Roman" w:eastAsia="Times New Roman" w:hAnsi="Times New Roman" w:cs="Times New Roman"/>
-          <w:color w:val="2E74B5" w:themeColor="accent5" w:themeShade="BF"/>
-          <w:kern w:val="0"/>
-          <w:lang w:bidi="th-TH"/>
-          <w14:ligatures w14:val="none"/>
-        </w:rPr>
-        <w:t xml:space="preserve"> </w:t>
-      </w:r>
-      <w:proofErr w:type="spellStart"/>
-      <w:r>
-        <w:rPr>
-          <w:rFonts w:ascii="Times New Roman" w:eastAsia="Times New Roman" w:hAnsi="Times New Roman" w:cs="Times New Roman"/>
-          <w:color w:val="2E74B5" w:themeColor="accent5" w:themeShade="BF"/>
+          <w:kern w:val="0"/>
+          <w:lang w:bidi="th-TH"/>
+          <w14:ligatures w14:val="none"/>
+        </w:rPr>
+        <w:t xml:space="preserve"> </w:t>
+      </w:r>
+      <w:proofErr w:type="spellStart"/>
+      <w:r>
+        <w:rPr>
+          <w:rFonts w:ascii="Times New Roman" w:eastAsia="Times New Roman" w:hAnsi="Times New Roman" w:cs="Times New Roman"/>
           <w:kern w:val="0"/>
           <w:lang w:bidi="th-TH"/>
           <w14:ligatures w14:val="none"/>
@@ -491,18 +447,16 @@
       <w:r>
         <w:rPr>
           <w:rFonts w:ascii="Times New Roman" w:eastAsia="Times New Roman" w:hAnsi="Times New Roman" w:cs="Times New Roman"/>
-          <w:color w:val="2E74B5" w:themeColor="accent5" w:themeShade="BF"/>
-          <w:kern w:val="0"/>
-          <w:lang w:bidi="th-TH"/>
-          <w14:ligatures w14:val="none"/>
-        </w:rPr>
-        <w:t xml:space="preserve"> </w:t>
-      </w:r>
-      <w:proofErr w:type="spellStart"/>
-      <w:r>
-        <w:rPr>
-          <w:rFonts w:ascii="Times New Roman" w:eastAsia="Times New Roman" w:hAnsi="Times New Roman" w:cs="Times New Roman"/>
-          <w:color w:val="2E74B5" w:themeColor="accent5" w:themeShade="BF"/>
+          <w:kern w:val="0"/>
+          <w:lang w:bidi="th-TH"/>
+          <w14:ligatures w14:val="none"/>
+        </w:rPr>
+        <w:t xml:space="preserve"> </w:t>
+      </w:r>
+      <w:proofErr w:type="spellStart"/>
+      <w:r>
+        <w:rPr>
+          <w:rFonts w:ascii="Times New Roman" w:eastAsia="Times New Roman" w:hAnsi="Times New Roman" w:cs="Times New Roman"/>
           <w:kern w:val="0"/>
           <w:lang w:bidi="th-TH"/>
           <w14:ligatures w14:val="none"/>
@@ -513,18 +467,16 @@
       <w:r>
         <w:rPr>
           <w:rFonts w:ascii="Times New Roman" w:eastAsia="Times New Roman" w:hAnsi="Times New Roman" w:cs="Times New Roman"/>
-          <w:color w:val="2E74B5" w:themeColor="accent5" w:themeShade="BF"/>
-          <w:kern w:val="0"/>
-          <w:lang w:bidi="th-TH"/>
-          <w14:ligatures w14:val="none"/>
-        </w:rPr>
-        <w:t xml:space="preserve"> </w:t>
-      </w:r>
-      <w:proofErr w:type="spellStart"/>
-      <w:r>
-        <w:rPr>
-          <w:rFonts w:ascii="Times New Roman" w:eastAsia="Times New Roman" w:hAnsi="Times New Roman" w:cs="Times New Roman"/>
-          <w:color w:val="2E74B5" w:themeColor="accent5" w:themeShade="BF"/>
+          <w:kern w:val="0"/>
+          <w:lang w:bidi="th-TH"/>
+          <w14:ligatures w14:val="none"/>
+        </w:rPr>
+        <w:t xml:space="preserve"> </w:t>
+      </w:r>
+      <w:proofErr w:type="spellStart"/>
+      <w:r>
+        <w:rPr>
+          <w:rFonts w:ascii="Times New Roman" w:eastAsia="Times New Roman" w:hAnsi="Times New Roman" w:cs="Times New Roman"/>
           <w:kern w:val="0"/>
           <w:lang w:bidi="th-TH"/>
           <w14:ligatures w14:val="none"/>
@@ -535,18 +487,16 @@
       <w:r>
         <w:rPr>
           <w:rFonts w:ascii="Times New Roman" w:eastAsia="Times New Roman" w:hAnsi="Times New Roman" w:cs="Times New Roman"/>
-          <w:color w:val="2E74B5" w:themeColor="accent5" w:themeShade="BF"/>
-          <w:kern w:val="0"/>
-          <w:lang w:bidi="th-TH"/>
-          <w14:ligatures w14:val="none"/>
-        </w:rPr>
-        <w:t xml:space="preserve"> </w:t>
-      </w:r>
-      <w:proofErr w:type="spellStart"/>
-      <w:r>
-        <w:rPr>
-          <w:rFonts w:ascii="Times New Roman" w:eastAsia="Times New Roman" w:hAnsi="Times New Roman" w:cs="Times New Roman"/>
-          <w:color w:val="2E74B5" w:themeColor="accent5" w:themeShade="BF"/>
+          <w:kern w:val="0"/>
+          <w:lang w:bidi="th-TH"/>
+          <w14:ligatures w14:val="none"/>
+        </w:rPr>
+        <w:t xml:space="preserve"> </w:t>
+      </w:r>
+      <w:proofErr w:type="spellStart"/>
+      <w:r>
+        <w:rPr>
+          <w:rFonts w:ascii="Times New Roman" w:eastAsia="Times New Roman" w:hAnsi="Times New Roman" w:cs="Times New Roman"/>
           <w:kern w:val="0"/>
           <w:lang w:bidi="th-TH"/>
           <w14:ligatures w14:val="none"/>
@@ -557,18 +507,16 @@
       <w:r>
         <w:rPr>
           <w:rFonts w:ascii="Times New Roman" w:eastAsia="Times New Roman" w:hAnsi="Times New Roman" w:cs="Times New Roman"/>
-          <w:color w:val="2E74B5" w:themeColor="accent5" w:themeShade="BF"/>
-          <w:kern w:val="0"/>
-          <w:lang w:bidi="th-TH"/>
-          <w14:ligatures w14:val="none"/>
-        </w:rPr>
-        <w:t xml:space="preserve"> </w:t>
-      </w:r>
-      <w:proofErr w:type="spellStart"/>
-      <w:r>
-        <w:rPr>
-          <w:rFonts w:ascii="Times New Roman" w:eastAsia="Times New Roman" w:hAnsi="Times New Roman" w:cs="Times New Roman"/>
-          <w:color w:val="2E74B5" w:themeColor="accent5" w:themeShade="BF"/>
+          <w:kern w:val="0"/>
+          <w:lang w:bidi="th-TH"/>
+          <w14:ligatures w14:val="none"/>
+        </w:rPr>
+        <w:t xml:space="preserve"> </w:t>
+      </w:r>
+      <w:proofErr w:type="spellStart"/>
+      <w:r>
+        <w:rPr>
+          <w:rFonts w:ascii="Times New Roman" w:eastAsia="Times New Roman" w:hAnsi="Times New Roman" w:cs="Times New Roman"/>
           <w:kern w:val="0"/>
           <w:lang w:bidi="th-TH"/>
           <w14:ligatures w14:val="none"/>
@@ -579,18 +527,16 @@
       <w:r>
         <w:rPr>
           <w:rFonts w:ascii="Times New Roman" w:eastAsia="Times New Roman" w:hAnsi="Times New Roman" w:cs="Times New Roman"/>
-          <w:color w:val="2E74B5" w:themeColor="accent5" w:themeShade="BF"/>
-          <w:kern w:val="0"/>
-          <w:lang w:bidi="th-TH"/>
-          <w14:ligatures w14:val="none"/>
-        </w:rPr>
-        <w:t xml:space="preserve"> </w:t>
-      </w:r>
-      <w:proofErr w:type="spellStart"/>
-      <w:r>
-        <w:rPr>
-          <w:rFonts w:ascii="Times New Roman" w:eastAsia="Times New Roman" w:hAnsi="Times New Roman" w:cs="Times New Roman"/>
-          <w:color w:val="2E74B5" w:themeColor="accent5" w:themeShade="BF"/>
+          <w:kern w:val="0"/>
+          <w:lang w:bidi="th-TH"/>
+          <w14:ligatures w14:val="none"/>
+        </w:rPr>
+        <w:t xml:space="preserve"> </w:t>
+      </w:r>
+      <w:proofErr w:type="spellStart"/>
+      <w:r>
+        <w:rPr>
+          <w:rFonts w:ascii="Times New Roman" w:eastAsia="Times New Roman" w:hAnsi="Times New Roman" w:cs="Times New Roman"/>
           <w:kern w:val="0"/>
           <w:lang w:bidi="th-TH"/>
           <w14:ligatures w14:val="none"/>
@@ -601,18 +547,16 @@
       <w:r>
         <w:rPr>
           <w:rFonts w:ascii="Times New Roman" w:eastAsia="Times New Roman" w:hAnsi="Times New Roman" w:cs="Times New Roman"/>
-          <w:color w:val="2E74B5" w:themeColor="accent5" w:themeShade="BF"/>
-          <w:kern w:val="0"/>
-          <w:lang w:bidi="th-TH"/>
-          <w14:ligatures w14:val="none"/>
-        </w:rPr>
-        <w:t xml:space="preserve"> </w:t>
-      </w:r>
-      <w:proofErr w:type="spellStart"/>
-      <w:r>
-        <w:rPr>
-          <w:rFonts w:ascii="Times New Roman" w:eastAsia="Times New Roman" w:hAnsi="Times New Roman" w:cs="Times New Roman"/>
-          <w:color w:val="2E74B5" w:themeColor="accent5" w:themeShade="BF"/>
+          <w:kern w:val="0"/>
+          <w:lang w:bidi="th-TH"/>
+          <w14:ligatures w14:val="none"/>
+        </w:rPr>
+        <w:t xml:space="preserve"> </w:t>
+      </w:r>
+      <w:proofErr w:type="spellStart"/>
+      <w:r>
+        <w:rPr>
+          <w:rFonts w:ascii="Times New Roman" w:eastAsia="Times New Roman" w:hAnsi="Times New Roman" w:cs="Times New Roman"/>
           <w:kern w:val="0"/>
           <w:lang w:bidi="th-TH"/>
           <w14:ligatures w14:val="none"/>
@@ -623,18 +567,16 @@
       <w:r>
         <w:rPr>
           <w:rFonts w:ascii="Times New Roman" w:eastAsia="Times New Roman" w:hAnsi="Times New Roman" w:cs="Times New Roman"/>
-          <w:color w:val="2E74B5" w:themeColor="accent5" w:themeShade="BF"/>
-          <w:kern w:val="0"/>
-          <w:lang w:bidi="th-TH"/>
-          <w14:ligatures w14:val="none"/>
-        </w:rPr>
-        <w:t xml:space="preserve"> </w:t>
-      </w:r>
-      <w:proofErr w:type="spellStart"/>
-      <w:r>
-        <w:rPr>
-          <w:rFonts w:ascii="Times New Roman" w:eastAsia="Times New Roman" w:hAnsi="Times New Roman" w:cs="Times New Roman"/>
-          <w:color w:val="2E74B5" w:themeColor="accent5" w:themeShade="BF"/>
+          <w:kern w:val="0"/>
+          <w:lang w:bidi="th-TH"/>
+          <w14:ligatures w14:val="none"/>
+        </w:rPr>
+        <w:t xml:space="preserve"> </w:t>
+      </w:r>
+      <w:proofErr w:type="spellStart"/>
+      <w:r>
+        <w:rPr>
+          <w:rFonts w:ascii="Times New Roman" w:eastAsia="Times New Roman" w:hAnsi="Times New Roman" w:cs="Times New Roman"/>
           <w:kern w:val="0"/>
           <w:lang w:bidi="th-TH"/>
           <w14:ligatures w14:val="none"/>
@@ -645,7 +587,6 @@
       <w:r>
         <w:rPr>
           <w:rFonts w:ascii="Times New Roman" w:eastAsia="Times New Roman" w:hAnsi="Times New Roman" w:cs="Times New Roman"/>
-          <w:color w:val="2E74B5" w:themeColor="accent5" w:themeShade="BF"/>
           <w:kern w:val="0"/>
           <w:lang w:bidi="th-TH"/>
           <w14:ligatures w14:val="none"/>
@@ -662,17 +603,15 @@
         <w:spacing w:after="0" w:line="240" w:lineRule="auto"/>
         <w:rPr>
           <w:rFonts w:ascii="Times New Roman" w:eastAsia="Times New Roman" w:hAnsi="Times New Roman" w:cs="Times New Roman"/>
-          <w:color w:val="2E74B5" w:themeColor="accent5" w:themeShade="BF"/>
-          <w:kern w:val="0"/>
-          <w:lang w:bidi="th-TH"/>
-          <w14:ligatures w14:val="none"/>
-        </w:rPr>
-      </w:pPr>
-      <w:proofErr w:type="spellStart"/>
-      <w:r>
-        <w:rPr>
-          <w:rFonts w:ascii="Times New Roman" w:eastAsia="Times New Roman" w:hAnsi="Times New Roman" w:cs="Times New Roman"/>
-          <w:color w:val="2E74B5" w:themeColor="accent5" w:themeShade="BF"/>
+          <w:kern w:val="0"/>
+          <w:lang w:bidi="th-TH"/>
+          <w14:ligatures w14:val="none"/>
+        </w:rPr>
+      </w:pPr>
+      <w:proofErr w:type="spellStart"/>
+      <w:r>
+        <w:rPr>
+          <w:rFonts w:ascii="Times New Roman" w:eastAsia="Times New Roman" w:hAnsi="Times New Roman" w:cs="Times New Roman"/>
           <w:kern w:val="0"/>
           <w:bdr w:val="none" w:sz="0" w:space="0" w:color="auto" w:frame="1"/>
           <w:lang w:bidi="th-TH"/>
@@ -684,7 +623,6 @@
       <w:r>
         <w:rPr>
           <w:rFonts w:ascii="Times New Roman" w:eastAsia="Times New Roman" w:hAnsi="Times New Roman" w:cs="Times New Roman"/>
-          <w:color w:val="2E74B5" w:themeColor="accent5" w:themeShade="BF"/>
           <w:kern w:val="0"/>
           <w:bdr w:val="none" w:sz="0" w:space="0" w:color="auto" w:frame="1"/>
           <w:lang w:bidi="th-TH"/>
@@ -696,7 +634,6 @@
       <w:r>
         <w:rPr>
           <w:rFonts w:ascii="Times New Roman" w:eastAsia="Times New Roman" w:hAnsi="Times New Roman" w:cs="Times New Roman"/>
-          <w:color w:val="2E74B5" w:themeColor="accent5" w:themeShade="BF"/>
           <w:kern w:val="0"/>
           <w:bdr w:val="none" w:sz="0" w:space="0" w:color="auto" w:frame="1"/>
           <w:lang w:bidi="th-TH"/>
@@ -708,7 +645,6 @@
       <w:r>
         <w:rPr>
           <w:rFonts w:ascii="Times New Roman" w:eastAsia="Times New Roman" w:hAnsi="Times New Roman" w:cs="Times New Roman"/>
-          <w:color w:val="2E74B5" w:themeColor="accent5" w:themeShade="BF"/>
           <w:kern w:val="0"/>
           <w:bdr w:val="none" w:sz="0" w:space="0" w:color="auto" w:frame="1"/>
           <w:lang w:bidi="th-TH"/>
@@ -720,7 +656,6 @@
       <w:r>
         <w:rPr>
           <w:rFonts w:ascii="Times New Roman" w:eastAsia="Times New Roman" w:hAnsi="Times New Roman" w:cs="Times New Roman"/>
-          <w:color w:val="2E74B5" w:themeColor="accent5" w:themeShade="BF"/>
           <w:kern w:val="0"/>
           <w:bdr w:val="none" w:sz="0" w:space="0" w:color="auto" w:frame="1"/>
           <w:lang w:bidi="th-TH"/>
@@ -732,7 +667,6 @@
       <w:r>
         <w:rPr>
           <w:rFonts w:ascii="Times New Roman" w:eastAsia="Times New Roman" w:hAnsi="Times New Roman" w:cs="Times New Roman"/>
-          <w:color w:val="2E74B5" w:themeColor="accent5" w:themeShade="BF"/>
           <w:kern w:val="0"/>
           <w:bdr w:val="none" w:sz="0" w:space="0" w:color="auto" w:frame="1"/>
           <w:lang w:bidi="th-TH"/>
@@ -750,17 +684,15 @@
         <w:spacing w:after="0" w:line="240" w:lineRule="auto"/>
         <w:rPr>
           <w:rFonts w:ascii="Times New Roman" w:eastAsia="Times New Roman" w:hAnsi="Times New Roman" w:cs="Times New Roman"/>
-          <w:color w:val="2E74B5" w:themeColor="accent5" w:themeShade="BF"/>
-          <w:kern w:val="0"/>
-          <w:lang w:bidi="th-TH"/>
-          <w14:ligatures w14:val="none"/>
-        </w:rPr>
-      </w:pPr>
-      <w:proofErr w:type="spellStart"/>
-      <w:r>
-        <w:rPr>
-          <w:rFonts w:ascii="Times New Roman" w:eastAsia="Times New Roman" w:hAnsi="Times New Roman" w:cs="Times New Roman"/>
-          <w:color w:val="2E74B5" w:themeColor="accent5" w:themeShade="BF"/>
+          <w:kern w:val="0"/>
+          <w:lang w:bidi="th-TH"/>
+          <w14:ligatures w14:val="none"/>
+        </w:rPr>
+      </w:pPr>
+      <w:proofErr w:type="spellStart"/>
+      <w:r>
+        <w:rPr>
+          <w:rFonts w:ascii="Times New Roman" w:eastAsia="Times New Roman" w:hAnsi="Times New Roman" w:cs="Times New Roman"/>
           <w:kern w:val="0"/>
           <w:bdr w:val="none" w:sz="0" w:space="0" w:color="auto" w:frame="1"/>
           <w:lang w:bidi="th-TH"/>
@@ -772,7 +704,6 @@
       <w:r>
         <w:rPr>
           <w:rFonts w:ascii="Times New Roman" w:eastAsia="Times New Roman" w:hAnsi="Times New Roman" w:cs="Times New Roman"/>
-          <w:color w:val="2E74B5" w:themeColor="accent5" w:themeShade="BF"/>
           <w:kern w:val="0"/>
           <w:bdr w:val="none" w:sz="0" w:space="0" w:color="auto" w:frame="1"/>
           <w:lang w:bidi="th-TH"/>
@@ -784,7 +715,6 @@
       <w:r>
         <w:rPr>
           <w:rFonts w:ascii="Times New Roman" w:eastAsia="Times New Roman" w:hAnsi="Times New Roman" w:cs="Times New Roman"/>
-          <w:color w:val="2E74B5" w:themeColor="accent5" w:themeShade="BF"/>
           <w:kern w:val="0"/>
           <w:bdr w:val="none" w:sz="0" w:space="0" w:color="auto" w:frame="1"/>
           <w:lang w:bidi="th-TH"/>
@@ -796,7 +726,6 @@
       <w:r>
         <w:rPr>
           <w:rFonts w:ascii="Times New Roman" w:eastAsia="Times New Roman" w:hAnsi="Times New Roman" w:cs="Times New Roman"/>
-          <w:color w:val="2E74B5" w:themeColor="accent5" w:themeShade="BF"/>
           <w:kern w:val="0"/>
           <w:bdr w:val="none" w:sz="0" w:space="0" w:color="auto" w:frame="1"/>
           <w:lang w:bidi="th-TH"/>
@@ -808,7 +737,6 @@
       <w:r>
         <w:rPr>
           <w:rFonts w:ascii="Times New Roman" w:eastAsia="Times New Roman" w:hAnsi="Times New Roman" w:cs="Times New Roman"/>
-          <w:color w:val="2E74B5" w:themeColor="accent5" w:themeShade="BF"/>
           <w:kern w:val="0"/>
           <w:bdr w:val="none" w:sz="0" w:space="0" w:color="auto" w:frame="1"/>
           <w:lang w:bidi="th-TH"/>
@@ -820,7 +748,6 @@
       <w:r>
         <w:rPr>
           <w:rFonts w:ascii="Times New Roman" w:eastAsia="Times New Roman" w:hAnsi="Times New Roman" w:cs="Times New Roman"/>
-          <w:color w:val="2E74B5" w:themeColor="accent5" w:themeShade="BF"/>
           <w:kern w:val="0"/>
           <w:bdr w:val="none" w:sz="0" w:space="0" w:color="auto" w:frame="1"/>
           <w:lang w:bidi="th-TH"/>
@@ -832,7 +759,6 @@
       <w:r>
         <w:rPr>
           <w:rFonts w:ascii="Times New Roman" w:eastAsia="Times New Roman" w:hAnsi="Times New Roman" w:cs="Times New Roman"/>
-          <w:color w:val="2E74B5" w:themeColor="accent5" w:themeShade="BF"/>
           <w:kern w:val="0"/>
           <w:bdr w:val="none" w:sz="0" w:space="0" w:color="auto" w:frame="1"/>
           <w:lang w:bidi="th-TH"/>
@@ -844,7 +770,6 @@
       <w:r>
         <w:rPr>
           <w:rFonts w:ascii="Times New Roman" w:eastAsia="Times New Roman" w:hAnsi="Times New Roman" w:cs="Times New Roman"/>
-          <w:color w:val="2E74B5" w:themeColor="accent5" w:themeShade="BF"/>
           <w:kern w:val="0"/>
           <w:bdr w:val="none" w:sz="0" w:space="0" w:color="auto" w:frame="1"/>
           <w:lang w:bidi="th-TH"/>
@@ -862,16 +787,14 @@
         <w:spacing w:after="0" w:line="240" w:lineRule="auto"/>
         <w:rPr>
           <w:rFonts w:ascii="Times New Roman" w:eastAsia="Times New Roman" w:hAnsi="Times New Roman" w:cs="Times New Roman"/>
-          <w:color w:val="2E74B5" w:themeColor="accent5" w:themeShade="BF"/>
-          <w:kern w:val="0"/>
-          <w:lang w:bidi="th-TH"/>
-          <w14:ligatures w14:val="none"/>
-        </w:rPr>
-      </w:pPr>
-      <w:r>
-        <w:rPr>
-          <w:rFonts w:ascii="Times New Roman" w:eastAsia="Times New Roman" w:hAnsi="Times New Roman" w:cs="Times New Roman"/>
-          <w:color w:val="2E74B5" w:themeColor="accent5" w:themeShade="BF"/>
+          <w:kern w:val="0"/>
+          <w:lang w:bidi="th-TH"/>
+          <w14:ligatures w14:val="none"/>
+        </w:rPr>
+      </w:pPr>
+      <w:r>
+        <w:rPr>
+          <w:rFonts w:ascii="Times New Roman" w:eastAsia="Times New Roman" w:hAnsi="Times New Roman" w:cs="Times New Roman"/>
           <w:kern w:val="0"/>
           <w:lang w:bidi="th-TH"/>
           <w14:ligatures w14:val="none"/>
@@ -882,7 +805,6 @@
       <w:r>
         <w:rPr>
           <w:rFonts w:ascii="Times New Roman" w:eastAsia="Times New Roman" w:hAnsi="Times New Roman" w:cs="Times New Roman"/>
-          <w:color w:val="2E74B5" w:themeColor="accent5" w:themeShade="BF"/>
           <w:kern w:val="0"/>
           <w:lang w:bidi="th-TH"/>
           <w14:ligatures w14:val="none"/>
@@ -893,18 +815,16 @@
       <w:r>
         <w:rPr>
           <w:rFonts w:ascii="Times New Roman" w:eastAsia="Times New Roman" w:hAnsi="Times New Roman" w:cs="Times New Roman"/>
-          <w:color w:val="2E74B5" w:themeColor="accent5" w:themeShade="BF"/>
-          <w:kern w:val="0"/>
-          <w:lang w:bidi="th-TH"/>
-          <w14:ligatures w14:val="none"/>
-        </w:rPr>
-        <w:t xml:space="preserve"> </w:t>
-      </w:r>
-      <w:proofErr w:type="spellStart"/>
-      <w:r>
-        <w:rPr>
-          <w:rFonts w:ascii="Times New Roman" w:eastAsia="Times New Roman" w:hAnsi="Times New Roman" w:cs="Times New Roman"/>
-          <w:color w:val="2E74B5" w:themeColor="accent5" w:themeShade="BF"/>
+          <w:kern w:val="0"/>
+          <w:lang w:bidi="th-TH"/>
+          <w14:ligatures w14:val="none"/>
+        </w:rPr>
+        <w:t xml:space="preserve"> </w:t>
+      </w:r>
+      <w:proofErr w:type="spellStart"/>
+      <w:r>
+        <w:rPr>
+          <w:rFonts w:ascii="Times New Roman" w:eastAsia="Times New Roman" w:hAnsi="Times New Roman" w:cs="Times New Roman"/>
           <w:kern w:val="0"/>
           <w:lang w:bidi="th-TH"/>
           <w14:ligatures w14:val="none"/>
@@ -915,7 +835,6 @@
       <w:r>
         <w:rPr>
           <w:rFonts w:ascii="Times New Roman" w:eastAsia="Times New Roman" w:hAnsi="Times New Roman" w:cs="Times New Roman"/>
-          <w:color w:val="2E74B5" w:themeColor="accent5" w:themeShade="BF"/>
           <w:kern w:val="0"/>
           <w:lang w:bidi="th-TH"/>
           <w14:ligatures w14:val="none"/>
@@ -926,7 +845,6 @@
       <w:r>
         <w:rPr>
           <w:rFonts w:ascii="Times New Roman" w:eastAsia="Times New Roman" w:hAnsi="Times New Roman" w:cs="Times New Roman"/>
-          <w:color w:val="2E74B5" w:themeColor="accent5" w:themeShade="BF"/>
           <w:kern w:val="0"/>
           <w:lang w:bidi="th-TH"/>
           <w14:ligatures w14:val="none"/>
@@ -937,7 +855,6 @@
       <w:r>
         <w:rPr>
           <w:rFonts w:ascii="Times New Roman" w:eastAsia="Times New Roman" w:hAnsi="Times New Roman" w:cs="Times New Roman"/>
-          <w:color w:val="2E74B5" w:themeColor="accent5" w:themeShade="BF"/>
           <w:kern w:val="0"/>
           <w:lang w:bidi="th-TH"/>
           <w14:ligatures w14:val="none"/>
@@ -948,7 +865,6 @@
       <w:r>
         <w:rPr>
           <w:rFonts w:ascii="Times New Roman" w:eastAsia="Times New Roman" w:hAnsi="Times New Roman" w:cs="Times New Roman"/>
-          <w:color w:val="2E74B5" w:themeColor="accent5" w:themeShade="BF"/>
           <w:kern w:val="0"/>
           <w:lang w:bidi="th-TH"/>
           <w14:ligatures w14:val="none"/>
@@ -959,18 +875,16 @@
       <w:r>
         <w:rPr>
           <w:rFonts w:ascii="Times New Roman" w:eastAsia="Times New Roman" w:hAnsi="Times New Roman" w:cs="Times New Roman"/>
-          <w:color w:val="2E74B5" w:themeColor="accent5" w:themeShade="BF"/>
-          <w:kern w:val="0"/>
-          <w:lang w:bidi="th-TH"/>
-          <w14:ligatures w14:val="none"/>
-        </w:rPr>
-        <w:t xml:space="preserve"> </w:t>
-      </w:r>
-      <w:proofErr w:type="spellStart"/>
-      <w:r>
-        <w:rPr>
-          <w:rFonts w:ascii="Times New Roman" w:eastAsia="Times New Roman" w:hAnsi="Times New Roman" w:cs="Times New Roman"/>
-          <w:color w:val="2E74B5" w:themeColor="accent5" w:themeShade="BF"/>
+          <w:kern w:val="0"/>
+          <w:lang w:bidi="th-TH"/>
+          <w14:ligatures w14:val="none"/>
+        </w:rPr>
+        <w:t xml:space="preserve"> </w:t>
+      </w:r>
+      <w:proofErr w:type="spellStart"/>
+      <w:r>
+        <w:rPr>
+          <w:rFonts w:ascii="Times New Roman" w:eastAsia="Times New Roman" w:hAnsi="Times New Roman" w:cs="Times New Roman"/>
           <w:kern w:val="0"/>
           <w:lang w:bidi="th-TH"/>
           <w14:ligatures w14:val="none"/>
@@ -981,18 +895,16 @@
       <w:r>
         <w:rPr>
           <w:rFonts w:ascii="Times New Roman" w:eastAsia="Times New Roman" w:hAnsi="Times New Roman" w:cs="Times New Roman"/>
-          <w:color w:val="2E74B5" w:themeColor="accent5" w:themeShade="BF"/>
-          <w:kern w:val="0"/>
-          <w:lang w:bidi="th-TH"/>
-          <w14:ligatures w14:val="none"/>
-        </w:rPr>
-        <w:t xml:space="preserve"> </w:t>
-      </w:r>
-      <w:proofErr w:type="spellStart"/>
-      <w:r>
-        <w:rPr>
-          <w:rFonts w:ascii="Times New Roman" w:eastAsia="Times New Roman" w:hAnsi="Times New Roman" w:cs="Times New Roman"/>
-          <w:color w:val="2E74B5" w:themeColor="accent5" w:themeShade="BF"/>
+          <w:kern w:val="0"/>
+          <w:lang w:bidi="th-TH"/>
+          <w14:ligatures w14:val="none"/>
+        </w:rPr>
+        <w:t xml:space="preserve"> </w:t>
+      </w:r>
+      <w:proofErr w:type="spellStart"/>
+      <w:r>
+        <w:rPr>
+          <w:rFonts w:ascii="Times New Roman" w:eastAsia="Times New Roman" w:hAnsi="Times New Roman" w:cs="Times New Roman"/>
           <w:kern w:val="0"/>
           <w:lang w:bidi="th-TH"/>
           <w14:ligatures w14:val="none"/>
@@ -1003,7 +915,6 @@
       <w:r>
         <w:rPr>
           <w:rFonts w:ascii="Times New Roman" w:eastAsia="Times New Roman" w:hAnsi="Times New Roman" w:cs="Times New Roman"/>
-          <w:color w:val="2E74B5" w:themeColor="accent5" w:themeShade="BF"/>
           <w:kern w:val="0"/>
           <w:lang w:bidi="th-TH"/>
           <w14:ligatures w14:val="none"/>
@@ -1014,7 +925,6 @@
       <w:r>
         <w:rPr>
           <w:rFonts w:ascii="Times New Roman" w:eastAsia="Times New Roman" w:hAnsi="Times New Roman" w:cs="Times New Roman"/>
-          <w:color w:val="2E74B5" w:themeColor="accent5" w:themeShade="BF"/>
           <w:kern w:val="0"/>
           <w:bdr w:val="none" w:sz="0" w:space="0" w:color="auto" w:frame="1"/>
           <w:lang w:bidi="th-TH"/>
@@ -1026,7 +936,6 @@
       <w:r>
         <w:rPr>
           <w:rFonts w:ascii="Times New Roman" w:eastAsia="Times New Roman" w:hAnsi="Times New Roman" w:cs="Times New Roman"/>
-          <w:color w:val="2E74B5" w:themeColor="accent5" w:themeShade="BF"/>
           <w:kern w:val="0"/>
           <w:lang w:bidi="th-TH"/>
           <w14:ligatures w14:val="none"/>
@@ -1036,7 +945,6 @@
       <w:r>
         <w:rPr>
           <w:rFonts w:ascii="Times New Roman" w:eastAsia="Times New Roman" w:hAnsi="Times New Roman" w:cs="Times New Roman"/>
-          <w:color w:val="2E74B5" w:themeColor="accent5" w:themeShade="BF"/>
           <w:kern w:val="0"/>
           <w:bdr w:val="none" w:sz="0" w:space="0" w:color="auto" w:frame="1"/>
           <w:lang w:bidi="th-TH"/>
@@ -1047,7 +955,6 @@
       <w:r>
         <w:rPr>
           <w:rFonts w:ascii="Times New Roman" w:eastAsia="Times New Roman" w:hAnsi="Times New Roman" w:cs="Times New Roman"/>
-          <w:color w:val="2E74B5" w:themeColor="accent5" w:themeShade="BF"/>
           <w:kern w:val="0"/>
           <w:lang w:bidi="th-TH"/>
           <w14:ligatures w14:val="none"/>
@@ -1058,7 +965,6 @@
       <w:r>
         <w:rPr>
           <w:rFonts w:ascii="Times New Roman" w:eastAsia="Times New Roman" w:hAnsi="Times New Roman" w:cs="Times New Roman"/>
-          <w:color w:val="2E74B5" w:themeColor="accent5" w:themeShade="BF"/>
           <w:kern w:val="0"/>
           <w:lang w:bidi="th-TH"/>
           <w14:ligatures w14:val="none"/>
@@ -1069,18 +975,16 @@
       <w:r>
         <w:rPr>
           <w:rFonts w:ascii="Times New Roman" w:eastAsia="Times New Roman" w:hAnsi="Times New Roman" w:cs="Times New Roman"/>
-          <w:color w:val="2E74B5" w:themeColor="accent5" w:themeShade="BF"/>
-          <w:kern w:val="0"/>
-          <w:lang w:bidi="th-TH"/>
-          <w14:ligatures w14:val="none"/>
-        </w:rPr>
-        <w:t xml:space="preserve"> </w:t>
-      </w:r>
-      <w:proofErr w:type="spellStart"/>
-      <w:r>
-        <w:rPr>
-          <w:rFonts w:ascii="Times New Roman" w:eastAsia="Times New Roman" w:hAnsi="Times New Roman" w:cs="Times New Roman"/>
-          <w:color w:val="2E74B5" w:themeColor="accent5" w:themeShade="BF"/>
+          <w:kern w:val="0"/>
+          <w:lang w:bidi="th-TH"/>
+          <w14:ligatures w14:val="none"/>
+        </w:rPr>
+        <w:t xml:space="preserve"> </w:t>
+      </w:r>
+      <w:proofErr w:type="spellStart"/>
+      <w:r>
+        <w:rPr>
+          <w:rFonts w:ascii="Times New Roman" w:eastAsia="Times New Roman" w:hAnsi="Times New Roman" w:cs="Times New Roman"/>
           <w:kern w:val="0"/>
           <w:lang w:bidi="th-TH"/>
           <w14:ligatures w14:val="none"/>
@@ -1091,7 +995,6 @@
       <w:r>
         <w:rPr>
           <w:rFonts w:ascii="Times New Roman" w:eastAsia="Times New Roman" w:hAnsi="Times New Roman" w:cs="Times New Roman"/>
-          <w:color w:val="2E74B5" w:themeColor="accent5" w:themeShade="BF"/>
           <w:kern w:val="0"/>
           <w:lang w:bidi="th-TH"/>
           <w14:ligatures w14:val="none"/>
@@ -1102,7 +1005,6 @@
       <w:r>
         <w:rPr>
           <w:rFonts w:ascii="Times New Roman" w:eastAsia="Times New Roman" w:hAnsi="Times New Roman" w:cs="Times New Roman"/>
-          <w:color w:val="2E74B5" w:themeColor="accent5" w:themeShade="BF"/>
           <w:kern w:val="0"/>
           <w:lang w:bidi="th-TH"/>
           <w14:ligatures w14:val="none"/>
@@ -1113,18 +1015,16 @@
       <w:r>
         <w:rPr>
           <w:rFonts w:ascii="Times New Roman" w:eastAsia="Times New Roman" w:hAnsi="Times New Roman" w:cs="Times New Roman"/>
-          <w:color w:val="2E74B5" w:themeColor="accent5" w:themeShade="BF"/>
-          <w:kern w:val="0"/>
-          <w:lang w:bidi="th-TH"/>
-          <w14:ligatures w14:val="none"/>
-        </w:rPr>
-        <w:t xml:space="preserve"> </w:t>
-      </w:r>
-      <w:proofErr w:type="spellStart"/>
-      <w:r>
-        <w:rPr>
-          <w:rFonts w:ascii="Times New Roman" w:eastAsia="Times New Roman" w:hAnsi="Times New Roman" w:cs="Times New Roman"/>
-          <w:color w:val="2E74B5" w:themeColor="accent5" w:themeShade="BF"/>
+          <w:kern w:val="0"/>
+          <w:lang w:bidi="th-TH"/>
+          <w14:ligatures w14:val="none"/>
+        </w:rPr>
+        <w:t xml:space="preserve"> </w:t>
+      </w:r>
+      <w:proofErr w:type="spellStart"/>
+      <w:r>
+        <w:rPr>
+          <w:rFonts w:ascii="Times New Roman" w:eastAsia="Times New Roman" w:hAnsi="Times New Roman" w:cs="Times New Roman"/>
           <w:kern w:val="0"/>
           <w:lang w:bidi="th-TH"/>
           <w14:ligatures w14:val="none"/>
@@ -1135,18 +1035,16 @@
       <w:r>
         <w:rPr>
           <w:rFonts w:ascii="Times New Roman" w:eastAsia="Times New Roman" w:hAnsi="Times New Roman" w:cs="Times New Roman"/>
-          <w:color w:val="2E74B5" w:themeColor="accent5" w:themeShade="BF"/>
-          <w:kern w:val="0"/>
-          <w:lang w:bidi="th-TH"/>
-          <w14:ligatures w14:val="none"/>
-        </w:rPr>
-        <w:t xml:space="preserve"> </w:t>
-      </w:r>
-      <w:proofErr w:type="spellStart"/>
-      <w:r>
-        <w:rPr>
-          <w:rFonts w:ascii="Times New Roman" w:eastAsia="Times New Roman" w:hAnsi="Times New Roman" w:cs="Times New Roman"/>
-          <w:color w:val="2E74B5" w:themeColor="accent5" w:themeShade="BF"/>
+          <w:kern w:val="0"/>
+          <w:lang w:bidi="th-TH"/>
+          <w14:ligatures w14:val="none"/>
+        </w:rPr>
+        <w:t xml:space="preserve"> </w:t>
+      </w:r>
+      <w:proofErr w:type="spellStart"/>
+      <w:r>
+        <w:rPr>
+          <w:rFonts w:ascii="Times New Roman" w:eastAsia="Times New Roman" w:hAnsi="Times New Roman" w:cs="Times New Roman"/>
           <w:kern w:val="0"/>
           <w:lang w:bidi="th-TH"/>
           <w14:ligatures w14:val="none"/>
@@ -1157,18 +1055,16 @@
       <w:r>
         <w:rPr>
           <w:rFonts w:ascii="Times New Roman" w:eastAsia="Times New Roman" w:hAnsi="Times New Roman" w:cs="Times New Roman"/>
-          <w:color w:val="2E74B5" w:themeColor="accent5" w:themeShade="BF"/>
-          <w:kern w:val="0"/>
-          <w:lang w:bidi="th-TH"/>
-          <w14:ligatures w14:val="none"/>
-        </w:rPr>
-        <w:t xml:space="preserve"> </w:t>
-      </w:r>
-      <w:proofErr w:type="spellStart"/>
-      <w:r>
-        <w:rPr>
-          <w:rFonts w:ascii="Times New Roman" w:eastAsia="Times New Roman" w:hAnsi="Times New Roman" w:cs="Times New Roman"/>
-          <w:color w:val="2E74B5" w:themeColor="accent5" w:themeShade="BF"/>
+          <w:kern w:val="0"/>
+          <w:lang w:bidi="th-TH"/>
+          <w14:ligatures w14:val="none"/>
+        </w:rPr>
+        <w:t xml:space="preserve"> </w:t>
+      </w:r>
+      <w:proofErr w:type="spellStart"/>
+      <w:r>
+        <w:rPr>
+          <w:rFonts w:ascii="Times New Roman" w:eastAsia="Times New Roman" w:hAnsi="Times New Roman" w:cs="Times New Roman"/>
           <w:kern w:val="0"/>
           <w:lang w:bidi="th-TH"/>
           <w14:ligatures w14:val="none"/>
@@ -1179,18 +1075,16 @@
       <w:r>
         <w:rPr>
           <w:rFonts w:ascii="Times New Roman" w:eastAsia="Times New Roman" w:hAnsi="Times New Roman" w:cs="Times New Roman"/>
-          <w:color w:val="2E74B5" w:themeColor="accent5" w:themeShade="BF"/>
-          <w:kern w:val="0"/>
-          <w:lang w:bidi="th-TH"/>
-          <w14:ligatures w14:val="none"/>
-        </w:rPr>
-        <w:t xml:space="preserve"> </w:t>
-      </w:r>
-      <w:proofErr w:type="spellStart"/>
-      <w:r>
-        <w:rPr>
-          <w:rFonts w:ascii="Times New Roman" w:eastAsia="Times New Roman" w:hAnsi="Times New Roman" w:cs="Times New Roman"/>
-          <w:color w:val="2E74B5" w:themeColor="accent5" w:themeShade="BF"/>
+          <w:kern w:val="0"/>
+          <w:lang w:bidi="th-TH"/>
+          <w14:ligatures w14:val="none"/>
+        </w:rPr>
+        <w:t xml:space="preserve"> </w:t>
+      </w:r>
+      <w:proofErr w:type="spellStart"/>
+      <w:r>
+        <w:rPr>
+          <w:rFonts w:ascii="Times New Roman" w:eastAsia="Times New Roman" w:hAnsi="Times New Roman" w:cs="Times New Roman"/>
           <w:kern w:val="0"/>
           <w:lang w:bidi="th-TH"/>
           <w14:ligatures w14:val="none"/>
@@ -1201,18 +1095,16 @@
       <w:r>
         <w:rPr>
           <w:rFonts w:ascii="Times New Roman" w:eastAsia="Times New Roman" w:hAnsi="Times New Roman" w:cs="Times New Roman"/>
-          <w:color w:val="2E74B5" w:themeColor="accent5" w:themeShade="BF"/>
-          <w:kern w:val="0"/>
-          <w:lang w:bidi="th-TH"/>
-          <w14:ligatures w14:val="none"/>
-        </w:rPr>
-        <w:t xml:space="preserve"> </w:t>
-      </w:r>
-      <w:proofErr w:type="spellStart"/>
-      <w:r>
-        <w:rPr>
-          <w:rFonts w:ascii="Times New Roman" w:eastAsia="Times New Roman" w:hAnsi="Times New Roman" w:cs="Times New Roman"/>
-          <w:color w:val="2E74B5" w:themeColor="accent5" w:themeShade="BF"/>
+          <w:kern w:val="0"/>
+          <w:lang w:bidi="th-TH"/>
+          <w14:ligatures w14:val="none"/>
+        </w:rPr>
+        <w:t xml:space="preserve"> </w:t>
+      </w:r>
+      <w:proofErr w:type="spellStart"/>
+      <w:r>
+        <w:rPr>
+          <w:rFonts w:ascii="Times New Roman" w:eastAsia="Times New Roman" w:hAnsi="Times New Roman" w:cs="Times New Roman"/>
           <w:kern w:val="0"/>
           <w:lang w:bidi="th-TH"/>
           <w14:ligatures w14:val="none"/>
@@ -1223,17 +1115,15 @@
       <w:r>
         <w:rPr>
           <w:rFonts w:ascii="Times New Roman" w:eastAsia="Times New Roman" w:hAnsi="Times New Roman" w:cs="Times New Roman"/>
-          <w:color w:val="2E74B5" w:themeColor="accent5" w:themeShade="BF"/>
-          <w:kern w:val="0"/>
-          <w:lang w:bidi="th-TH"/>
-          <w14:ligatures w14:val="none"/>
-        </w:rPr>
-        <w:t xml:space="preserve"> </w:t>
-      </w:r>
-      <w:r>
-        <w:rPr>
-          <w:rFonts w:ascii="Times New Roman" w:eastAsia="Times New Roman" w:hAnsi="Times New Roman" w:cs="Times New Roman"/>
-          <w:color w:val="2E74B5" w:themeColor="accent5" w:themeShade="BF"/>
+          <w:kern w:val="0"/>
+          <w:lang w:bidi="th-TH"/>
+          <w14:ligatures w14:val="none"/>
+        </w:rPr>
+        <w:t xml:space="preserve"> </w:t>
+      </w:r>
+      <w:r>
+        <w:rPr>
+          <w:rFonts w:ascii="Times New Roman" w:eastAsia="Times New Roman" w:hAnsi="Times New Roman" w:cs="Times New Roman"/>
           <w:kern w:val="0"/>
           <w:bdr w:val="none" w:sz="0" w:space="0" w:color="auto" w:frame="1"/>
           <w:lang w:bidi="th-TH"/>
@@ -1244,7 +1134,6 @@
       <w:r>
         <w:rPr>
           <w:rFonts w:ascii="Times New Roman" w:eastAsia="Times New Roman" w:hAnsi="Times New Roman" w:cs="Times New Roman"/>
-          <w:color w:val="2E74B5" w:themeColor="accent5" w:themeShade="BF"/>
           <w:kern w:val="0"/>
           <w:lang w:bidi="th-TH"/>
           <w14:ligatures w14:val="none"/>
@@ -1254,7 +1143,6 @@
       <w:r>
         <w:rPr>
           <w:rFonts w:ascii="Times New Roman" w:eastAsia="Times New Roman" w:hAnsi="Times New Roman" w:cs="Times New Roman"/>
-          <w:color w:val="2E74B5" w:themeColor="accent5" w:themeShade="BF"/>
           <w:kern w:val="0"/>
           <w:bdr w:val="none" w:sz="0" w:space="0" w:color="auto" w:frame="1"/>
           <w:lang w:bidi="th-TH"/>
@@ -1265,7 +1153,6 @@
       <w:r>
         <w:rPr>
           <w:rFonts w:ascii="Times New Roman" w:eastAsia="Times New Roman" w:hAnsi="Times New Roman" w:cs="Times New Roman"/>
-          <w:color w:val="2E74B5" w:themeColor="accent5" w:themeShade="BF"/>
           <w:kern w:val="0"/>
           <w:lang w:bidi="th-TH"/>
           <w14:ligatures w14:val="none"/>
@@ -1275,7 +1162,6 @@
       <w:r>
         <w:rPr>
           <w:rFonts w:ascii="Times New Roman" w:eastAsia="Times New Roman" w:hAnsi="Times New Roman" w:cs="Times New Roman"/>
-          <w:color w:val="2E74B5" w:themeColor="accent5" w:themeShade="BF"/>
           <w:kern w:val="0"/>
           <w:bdr w:val="none" w:sz="0" w:space="0" w:color="auto" w:frame="1"/>
           <w:lang w:bidi="th-TH"/>
@@ -1286,7 +1172,6 @@
       <w:r>
         <w:rPr>
           <w:rFonts w:ascii="Times New Roman" w:eastAsia="Times New Roman" w:hAnsi="Times New Roman" w:cs="Times New Roman"/>
-          <w:color w:val="2E74B5" w:themeColor="accent5" w:themeShade="BF"/>
           <w:kern w:val="0"/>
           <w:lang w:bidi="th-TH"/>
           <w14:ligatures w14:val="none"/>
@@ -1296,7 +1181,6 @@
       <w:r>
         <w:rPr>
           <w:rFonts w:ascii="Times New Roman" w:eastAsia="Times New Roman" w:hAnsi="Times New Roman" w:cs="Times New Roman"/>
-          <w:color w:val="2E74B5" w:themeColor="accent5" w:themeShade="BF"/>
           <w:kern w:val="0"/>
           <w:bdr w:val="none" w:sz="0" w:space="0" w:color="auto" w:frame="1"/>
           <w:lang w:bidi="th-TH"/>
@@ -1307,7 +1191,6 @@
       <w:r>
         <w:rPr>
           <w:rFonts w:ascii="Times New Roman" w:eastAsia="Times New Roman" w:hAnsi="Times New Roman" w:cs="Times New Roman"/>
-          <w:color w:val="2E74B5" w:themeColor="accent5" w:themeShade="BF"/>
           <w:kern w:val="0"/>
           <w:lang w:bidi="th-TH"/>
           <w14:ligatures w14:val="none"/>
@@ -1318,7 +1201,6 @@
       <w:r>
         <w:rPr>
           <w:rFonts w:ascii="Times New Roman" w:eastAsia="Times New Roman" w:hAnsi="Times New Roman" w:cs="Times New Roman"/>
-          <w:color w:val="2E74B5" w:themeColor="accent5" w:themeShade="BF"/>
           <w:kern w:val="0"/>
           <w:lang w:bidi="th-TH"/>
           <w14:ligatures w14:val="none"/>
@@ -1329,18 +1211,16 @@
       <w:r>
         <w:rPr>
           <w:rFonts w:ascii="Times New Roman" w:eastAsia="Times New Roman" w:hAnsi="Times New Roman" w:cs="Times New Roman"/>
-          <w:color w:val="2E74B5" w:themeColor="accent5" w:themeShade="BF"/>
-          <w:kern w:val="0"/>
-          <w:lang w:bidi="th-TH"/>
-          <w14:ligatures w14:val="none"/>
-        </w:rPr>
-        <w:t xml:space="preserve"> </w:t>
-      </w:r>
-      <w:proofErr w:type="spellStart"/>
-      <w:r>
-        <w:rPr>
-          <w:rFonts w:ascii="Times New Roman" w:eastAsia="Times New Roman" w:hAnsi="Times New Roman" w:cs="Times New Roman"/>
-          <w:color w:val="2E74B5" w:themeColor="accent5" w:themeShade="BF"/>
+          <w:kern w:val="0"/>
+          <w:lang w:bidi="th-TH"/>
+          <w14:ligatures w14:val="none"/>
+        </w:rPr>
+        <w:t xml:space="preserve"> </w:t>
+      </w:r>
+      <w:proofErr w:type="spellStart"/>
+      <w:r>
+        <w:rPr>
+          <w:rFonts w:ascii="Times New Roman" w:eastAsia="Times New Roman" w:hAnsi="Times New Roman" w:cs="Times New Roman"/>
           <w:kern w:val="0"/>
           <w:bdr w:val="none" w:sz="0" w:space="0" w:color="auto" w:frame="1"/>
           <w:lang w:bidi="th-TH"/>
@@ -1352,7 +1232,6 @@
       <w:r>
         <w:rPr>
           <w:rFonts w:ascii="Times New Roman" w:eastAsia="Times New Roman" w:hAnsi="Times New Roman" w:cs="Times New Roman"/>
-          <w:color w:val="2E74B5" w:themeColor="accent5" w:themeShade="BF"/>
           <w:kern w:val="0"/>
           <w:lang w:bidi="th-TH"/>
           <w14:ligatures w14:val="none"/>
@@ -1369,17 +1248,15 @@
         <w:spacing w:after="0" w:line="240" w:lineRule="auto"/>
         <w:rPr>
           <w:rFonts w:ascii="Times New Roman" w:eastAsia="Times New Roman" w:hAnsi="Times New Roman" w:cs="Times New Roman"/>
-          <w:color w:val="2E74B5" w:themeColor="accent5" w:themeShade="BF"/>
-          <w:kern w:val="0"/>
-          <w:lang w:bidi="th-TH"/>
-          <w14:ligatures w14:val="none"/>
-        </w:rPr>
-      </w:pPr>
-      <w:proofErr w:type="spellStart"/>
-      <w:r>
-        <w:rPr>
-          <w:rFonts w:ascii="Times New Roman" w:eastAsia="Times New Roman" w:hAnsi="Times New Roman" w:cs="Times New Roman"/>
-          <w:color w:val="2E74B5" w:themeColor="accent5" w:themeShade="BF"/>
+          <w:kern w:val="0"/>
+          <w:lang w:bidi="th-TH"/>
+          <w14:ligatures w14:val="none"/>
+        </w:rPr>
+      </w:pPr>
+      <w:proofErr w:type="spellStart"/>
+      <w:r>
+        <w:rPr>
+          <w:rFonts w:ascii="Times New Roman" w:eastAsia="Times New Roman" w:hAnsi="Times New Roman" w:cs="Times New Roman"/>
           <w:kern w:val="0"/>
           <w:bdr w:val="none" w:sz="0" w:space="0" w:color="auto" w:frame="1"/>
           <w:lang w:bidi="th-TH"/>
@@ -1391,7 +1268,6 @@
       <w:r>
         <w:rPr>
           <w:rFonts w:ascii="Times New Roman" w:eastAsia="Times New Roman" w:hAnsi="Times New Roman" w:cs="Times New Roman"/>
-          <w:color w:val="2E74B5" w:themeColor="accent5" w:themeShade="BF"/>
           <w:kern w:val="0"/>
           <w:bdr w:val="none" w:sz="0" w:space="0" w:color="auto" w:frame="1"/>
           <w:lang w:bidi="th-TH"/>
@@ -1403,7 +1279,6 @@
       <w:r>
         <w:rPr>
           <w:rFonts w:ascii="Times New Roman" w:eastAsia="Times New Roman" w:hAnsi="Times New Roman" w:cs="Times New Roman"/>
-          <w:color w:val="2E74B5" w:themeColor="accent5" w:themeShade="BF"/>
           <w:kern w:val="0"/>
           <w:bdr w:val="none" w:sz="0" w:space="0" w:color="auto" w:frame="1"/>
           <w:lang w:bidi="th-TH"/>
@@ -1415,7 +1290,6 @@
       <w:r>
         <w:rPr>
           <w:rFonts w:ascii="Times New Roman" w:eastAsia="Times New Roman" w:hAnsi="Times New Roman" w:cs="Times New Roman"/>
-          <w:color w:val="2E74B5" w:themeColor="accent5" w:themeShade="BF"/>
           <w:kern w:val="0"/>
           <w:bdr w:val="none" w:sz="0" w:space="0" w:color="auto" w:frame="1"/>
           <w:lang w:bidi="th-TH"/>
@@ -1427,7 +1301,6 @@
       <w:r>
         <w:rPr>
           <w:rFonts w:ascii="Times New Roman" w:eastAsia="Times New Roman" w:hAnsi="Times New Roman" w:cs="Times New Roman"/>
-          <w:color w:val="2E74B5" w:themeColor="accent5" w:themeShade="BF"/>
           <w:kern w:val="0"/>
           <w:bdr w:val="none" w:sz="0" w:space="0" w:color="auto" w:frame="1"/>
           <w:lang w:bidi="th-TH"/>
@@ -1439,7 +1312,6 @@
       <w:r>
         <w:rPr>
           <w:rFonts w:ascii="Times New Roman" w:eastAsia="Times New Roman" w:hAnsi="Times New Roman" w:cs="Times New Roman"/>
-          <w:color w:val="2E74B5" w:themeColor="accent5" w:themeShade="BF"/>
           <w:kern w:val="0"/>
           <w:bdr w:val="none" w:sz="0" w:space="0" w:color="auto" w:frame="1"/>
           <w:lang w:bidi="th-TH"/>
@@ -1451,7 +1323,6 @@
       <w:r>
         <w:rPr>
           <w:rFonts w:ascii="Times New Roman" w:eastAsia="Times New Roman" w:hAnsi="Times New Roman" w:cs="Times New Roman"/>
-          <w:color w:val="2E74B5" w:themeColor="accent5" w:themeShade="BF"/>
           <w:kern w:val="0"/>
           <w:bdr w:val="none" w:sz="0" w:space="0" w:color="auto" w:frame="1"/>
           <w:lang w:bidi="th-TH"/>
@@ -1463,7 +1334,6 @@
       <w:r>
         <w:rPr>
           <w:rFonts w:ascii="Times New Roman" w:eastAsia="Times New Roman" w:hAnsi="Times New Roman" w:cs="Times New Roman"/>
-          <w:color w:val="2E74B5" w:themeColor="accent5" w:themeShade="BF"/>
           <w:kern w:val="0"/>
           <w:bdr w:val="none" w:sz="0" w:space="0" w:color="auto" w:frame="1"/>
           <w:lang w:bidi="th-TH"/>
@@ -1474,18 +1344,16 @@
       <w:r>
         <w:rPr>
           <w:rFonts w:ascii="Times New Roman" w:eastAsia="Times New Roman" w:hAnsi="Times New Roman" w:cs="Times New Roman"/>
-          <w:color w:val="2E74B5" w:themeColor="accent5" w:themeShade="BF"/>
-          <w:kern w:val="0"/>
-          <w:lang w:bidi="th-TH"/>
-          <w14:ligatures w14:val="none"/>
-        </w:rPr>
-        <w:t xml:space="preserve"> </w:t>
-      </w:r>
-      <w:proofErr w:type="spellStart"/>
-      <w:r>
-        <w:rPr>
-          <w:rFonts w:ascii="Times New Roman" w:eastAsia="Times New Roman" w:hAnsi="Times New Roman" w:cs="Times New Roman"/>
-          <w:color w:val="2E74B5" w:themeColor="accent5" w:themeShade="BF"/>
+          <w:kern w:val="0"/>
+          <w:lang w:bidi="th-TH"/>
+          <w14:ligatures w14:val="none"/>
+        </w:rPr>
+        <w:t xml:space="preserve"> </w:t>
+      </w:r>
+      <w:proofErr w:type="spellStart"/>
+      <w:r>
+        <w:rPr>
+          <w:rFonts w:ascii="Times New Roman" w:eastAsia="Times New Roman" w:hAnsi="Times New Roman" w:cs="Times New Roman"/>
           <w:kern w:val="0"/>
           <w:lang w:bidi="th-TH"/>
           <w14:ligatures w14:val="none"/>
@@ -1496,18 +1364,16 @@
       <w:r>
         <w:rPr>
           <w:rFonts w:ascii="Times New Roman" w:eastAsia="Times New Roman" w:hAnsi="Times New Roman" w:cs="Times New Roman"/>
-          <w:color w:val="2E74B5" w:themeColor="accent5" w:themeShade="BF"/>
-          <w:kern w:val="0"/>
-          <w:lang w:bidi="th-TH"/>
-          <w14:ligatures w14:val="none"/>
-        </w:rPr>
-        <w:t xml:space="preserve"> </w:t>
-      </w:r>
-      <w:proofErr w:type="spellStart"/>
-      <w:r>
-        <w:rPr>
-          <w:rFonts w:ascii="Times New Roman" w:eastAsia="Times New Roman" w:hAnsi="Times New Roman" w:cs="Times New Roman"/>
-          <w:color w:val="2E74B5" w:themeColor="accent5" w:themeShade="BF"/>
+          <w:kern w:val="0"/>
+          <w:lang w:bidi="th-TH"/>
+          <w14:ligatures w14:val="none"/>
+        </w:rPr>
+        <w:t xml:space="preserve"> </w:t>
+      </w:r>
+      <w:proofErr w:type="spellStart"/>
+      <w:r>
+        <w:rPr>
+          <w:rFonts w:ascii="Times New Roman" w:eastAsia="Times New Roman" w:hAnsi="Times New Roman" w:cs="Times New Roman"/>
           <w:kern w:val="0"/>
           <w:lang w:bidi="th-TH"/>
           <w14:ligatures w14:val="none"/>
@@ -1518,18 +1384,16 @@
       <w:r>
         <w:rPr>
           <w:rFonts w:ascii="Times New Roman" w:eastAsia="Times New Roman" w:hAnsi="Times New Roman" w:cs="Times New Roman"/>
-          <w:color w:val="2E74B5" w:themeColor="accent5" w:themeShade="BF"/>
-          <w:kern w:val="0"/>
-          <w:lang w:bidi="th-TH"/>
-          <w14:ligatures w14:val="none"/>
-        </w:rPr>
-        <w:t xml:space="preserve"> </w:t>
-      </w:r>
-      <w:proofErr w:type="spellStart"/>
-      <w:r>
-        <w:rPr>
-          <w:rFonts w:ascii="Times New Roman" w:eastAsia="Times New Roman" w:hAnsi="Times New Roman" w:cs="Times New Roman"/>
-          <w:color w:val="2E74B5" w:themeColor="accent5" w:themeShade="BF"/>
+          <w:kern w:val="0"/>
+          <w:lang w:bidi="th-TH"/>
+          <w14:ligatures w14:val="none"/>
+        </w:rPr>
+        <w:t xml:space="preserve"> </w:t>
+      </w:r>
+      <w:proofErr w:type="spellStart"/>
+      <w:r>
+        <w:rPr>
+          <w:rFonts w:ascii="Times New Roman" w:eastAsia="Times New Roman" w:hAnsi="Times New Roman" w:cs="Times New Roman"/>
           <w:kern w:val="0"/>
           <w:bdr w:val="none" w:sz="0" w:space="0" w:color="auto" w:frame="1"/>
           <w:lang w:bidi="th-TH"/>
@@ -1541,18 +1405,16 @@
       <w:r>
         <w:rPr>
           <w:rFonts w:ascii="Times New Roman" w:eastAsia="Times New Roman" w:hAnsi="Times New Roman" w:cs="Times New Roman"/>
-          <w:color w:val="2E74B5" w:themeColor="accent5" w:themeShade="BF"/>
-          <w:kern w:val="0"/>
-          <w:lang w:bidi="th-TH"/>
-          <w14:ligatures w14:val="none"/>
-        </w:rPr>
-        <w:t xml:space="preserve"> </w:t>
-      </w:r>
-      <w:proofErr w:type="spellStart"/>
-      <w:r>
-        <w:rPr>
-          <w:rFonts w:ascii="Times New Roman" w:eastAsia="Times New Roman" w:hAnsi="Times New Roman" w:cs="Times New Roman"/>
-          <w:color w:val="2E74B5" w:themeColor="accent5" w:themeShade="BF"/>
+          <w:kern w:val="0"/>
+          <w:lang w:bidi="th-TH"/>
+          <w14:ligatures w14:val="none"/>
+        </w:rPr>
+        <w:t xml:space="preserve"> </w:t>
+      </w:r>
+      <w:proofErr w:type="spellStart"/>
+      <w:r>
+        <w:rPr>
+          <w:rFonts w:ascii="Times New Roman" w:eastAsia="Times New Roman" w:hAnsi="Times New Roman" w:cs="Times New Roman"/>
           <w:kern w:val="0"/>
           <w:lang w:bidi="th-TH"/>
           <w14:ligatures w14:val="none"/>
@@ -1563,18 +1425,16 @@
       <w:r>
         <w:rPr>
           <w:rFonts w:ascii="Times New Roman" w:eastAsia="Times New Roman" w:hAnsi="Times New Roman" w:cs="Times New Roman"/>
-          <w:color w:val="2E74B5" w:themeColor="accent5" w:themeShade="BF"/>
-          <w:kern w:val="0"/>
-          <w:lang w:bidi="th-TH"/>
-          <w14:ligatures w14:val="none"/>
-        </w:rPr>
-        <w:t xml:space="preserve"> </w:t>
-      </w:r>
-      <w:proofErr w:type="spellStart"/>
-      <w:r>
-        <w:rPr>
-          <w:rFonts w:ascii="Times New Roman" w:eastAsia="Times New Roman" w:hAnsi="Times New Roman" w:cs="Times New Roman"/>
-          <w:color w:val="2E74B5" w:themeColor="accent5" w:themeShade="BF"/>
+          <w:kern w:val="0"/>
+          <w:lang w:bidi="th-TH"/>
+          <w14:ligatures w14:val="none"/>
+        </w:rPr>
+        <w:t xml:space="preserve"> </w:t>
+      </w:r>
+      <w:proofErr w:type="spellStart"/>
+      <w:r>
+        <w:rPr>
+          <w:rFonts w:ascii="Times New Roman" w:eastAsia="Times New Roman" w:hAnsi="Times New Roman" w:cs="Times New Roman"/>
           <w:kern w:val="0"/>
           <w:lang w:bidi="th-TH"/>
           <w14:ligatures w14:val="none"/>
@@ -1585,18 +1445,16 @@
       <w:r>
         <w:rPr>
           <w:rFonts w:ascii="Times New Roman" w:eastAsia="Times New Roman" w:hAnsi="Times New Roman" w:cs="Times New Roman"/>
-          <w:color w:val="2E74B5" w:themeColor="accent5" w:themeShade="BF"/>
-          <w:kern w:val="0"/>
-          <w:lang w:bidi="th-TH"/>
-          <w14:ligatures w14:val="none"/>
-        </w:rPr>
-        <w:t xml:space="preserve"> </w:t>
-      </w:r>
-      <w:proofErr w:type="spellStart"/>
-      <w:r>
-        <w:rPr>
-          <w:rFonts w:ascii="Times New Roman" w:eastAsia="Times New Roman" w:hAnsi="Times New Roman" w:cs="Times New Roman"/>
-          <w:color w:val="2E74B5" w:themeColor="accent5" w:themeShade="BF"/>
+          <w:kern w:val="0"/>
+          <w:lang w:bidi="th-TH"/>
+          <w14:ligatures w14:val="none"/>
+        </w:rPr>
+        <w:t xml:space="preserve"> </w:t>
+      </w:r>
+      <w:proofErr w:type="spellStart"/>
+      <w:r>
+        <w:rPr>
+          <w:rFonts w:ascii="Times New Roman" w:eastAsia="Times New Roman" w:hAnsi="Times New Roman" w:cs="Times New Roman"/>
           <w:kern w:val="0"/>
           <w:lang w:bidi="th-TH"/>
           <w14:ligatures w14:val="none"/>
@@ -1607,18 +1465,16 @@
       <w:r>
         <w:rPr>
           <w:rFonts w:ascii="Times New Roman" w:eastAsia="Times New Roman" w:hAnsi="Times New Roman" w:cs="Times New Roman"/>
-          <w:color w:val="2E74B5" w:themeColor="accent5" w:themeShade="BF"/>
-          <w:kern w:val="0"/>
-          <w:lang w:bidi="th-TH"/>
-          <w14:ligatures w14:val="none"/>
-        </w:rPr>
-        <w:t xml:space="preserve"> </w:t>
-      </w:r>
-      <w:proofErr w:type="spellStart"/>
-      <w:r>
-        <w:rPr>
-          <w:rFonts w:ascii="Times New Roman" w:eastAsia="Times New Roman" w:hAnsi="Times New Roman" w:cs="Times New Roman"/>
-          <w:color w:val="2E74B5" w:themeColor="accent5" w:themeShade="BF"/>
+          <w:kern w:val="0"/>
+          <w:lang w:bidi="th-TH"/>
+          <w14:ligatures w14:val="none"/>
+        </w:rPr>
+        <w:t xml:space="preserve"> </w:t>
+      </w:r>
+      <w:proofErr w:type="spellStart"/>
+      <w:r>
+        <w:rPr>
+          <w:rFonts w:ascii="Times New Roman" w:eastAsia="Times New Roman" w:hAnsi="Times New Roman" w:cs="Times New Roman"/>
           <w:kern w:val="0"/>
           <w:lang w:bidi="th-TH"/>
           <w14:ligatures w14:val="none"/>
@@ -1629,18 +1485,16 @@
       <w:r>
         <w:rPr>
           <w:rFonts w:ascii="Times New Roman" w:eastAsia="Times New Roman" w:hAnsi="Times New Roman" w:cs="Times New Roman"/>
-          <w:color w:val="2E74B5" w:themeColor="accent5" w:themeShade="BF"/>
-          <w:kern w:val="0"/>
-          <w:lang w:bidi="th-TH"/>
-          <w14:ligatures w14:val="none"/>
-        </w:rPr>
-        <w:t xml:space="preserve"> </w:t>
-      </w:r>
-      <w:proofErr w:type="spellStart"/>
-      <w:r>
-        <w:rPr>
-          <w:rFonts w:ascii="Times New Roman" w:eastAsia="Times New Roman" w:hAnsi="Times New Roman" w:cs="Times New Roman"/>
-          <w:color w:val="2E74B5" w:themeColor="accent5" w:themeShade="BF"/>
+          <w:kern w:val="0"/>
+          <w:lang w:bidi="th-TH"/>
+          <w14:ligatures w14:val="none"/>
+        </w:rPr>
+        <w:t xml:space="preserve"> </w:t>
+      </w:r>
+      <w:proofErr w:type="spellStart"/>
+      <w:r>
+        <w:rPr>
+          <w:rFonts w:ascii="Times New Roman" w:eastAsia="Times New Roman" w:hAnsi="Times New Roman" w:cs="Times New Roman"/>
           <w:kern w:val="0"/>
           <w:lang w:bidi="th-TH"/>
           <w14:ligatures w14:val="none"/>
@@ -1651,7 +1505,6 @@
       <w:r>
         <w:rPr>
           <w:rFonts w:ascii="Times New Roman" w:eastAsia="Times New Roman" w:hAnsi="Times New Roman" w:cs="Times New Roman"/>
-          <w:color w:val="2E74B5" w:themeColor="accent5" w:themeShade="BF"/>
           <w:kern w:val="0"/>
           <w:lang w:bidi="th-TH"/>
           <w14:ligatures w14:val="none"/>
@@ -1662,7 +1515,6 @@
       <w:r>
         <w:rPr>
           <w:rFonts w:ascii="Times New Roman" w:eastAsia="Times New Roman" w:hAnsi="Times New Roman" w:cs="Times New Roman"/>
-          <w:color w:val="2E74B5" w:themeColor="accent5" w:themeShade="BF"/>
           <w:kern w:val="0"/>
           <w:lang w:bidi="th-TH"/>
           <w14:ligatures w14:val="none"/>
@@ -1673,18 +1525,16 @@
       <w:r>
         <w:rPr>
           <w:rFonts w:ascii="Times New Roman" w:eastAsia="Times New Roman" w:hAnsi="Times New Roman" w:cs="Times New Roman"/>
-          <w:color w:val="2E74B5" w:themeColor="accent5" w:themeShade="BF"/>
-          <w:kern w:val="0"/>
-          <w:lang w:bidi="th-TH"/>
-          <w14:ligatures w14:val="none"/>
-        </w:rPr>
-        <w:t xml:space="preserve"> </w:t>
-      </w:r>
-      <w:proofErr w:type="spellStart"/>
-      <w:r>
-        <w:rPr>
-          <w:rFonts w:ascii="Times New Roman" w:eastAsia="Times New Roman" w:hAnsi="Times New Roman" w:cs="Times New Roman"/>
-          <w:color w:val="2E74B5" w:themeColor="accent5" w:themeShade="BF"/>
+          <w:kern w:val="0"/>
+          <w:lang w:bidi="th-TH"/>
+          <w14:ligatures w14:val="none"/>
+        </w:rPr>
+        <w:t xml:space="preserve"> </w:t>
+      </w:r>
+      <w:proofErr w:type="spellStart"/>
+      <w:r>
+        <w:rPr>
+          <w:rFonts w:ascii="Times New Roman" w:eastAsia="Times New Roman" w:hAnsi="Times New Roman" w:cs="Times New Roman"/>
           <w:kern w:val="0"/>
           <w:lang w:bidi="th-TH"/>
           <w14:ligatures w14:val="none"/>
@@ -1695,18 +1545,16 @@
       <w:r>
         <w:rPr>
           <w:rFonts w:ascii="Times New Roman" w:eastAsia="Times New Roman" w:hAnsi="Times New Roman" w:cs="Times New Roman"/>
-          <w:color w:val="2E74B5" w:themeColor="accent5" w:themeShade="BF"/>
-          <w:kern w:val="0"/>
-          <w:lang w:bidi="th-TH"/>
-          <w14:ligatures w14:val="none"/>
-        </w:rPr>
-        <w:t xml:space="preserve"> </w:t>
-      </w:r>
-      <w:proofErr w:type="spellStart"/>
-      <w:r>
-        <w:rPr>
-          <w:rFonts w:ascii="Times New Roman" w:eastAsia="Times New Roman" w:hAnsi="Times New Roman" w:cs="Times New Roman"/>
-          <w:color w:val="2E74B5" w:themeColor="accent5" w:themeShade="BF"/>
+          <w:kern w:val="0"/>
+          <w:lang w:bidi="th-TH"/>
+          <w14:ligatures w14:val="none"/>
+        </w:rPr>
+        <w:t xml:space="preserve"> </w:t>
+      </w:r>
+      <w:proofErr w:type="spellStart"/>
+      <w:r>
+        <w:rPr>
+          <w:rFonts w:ascii="Times New Roman" w:eastAsia="Times New Roman" w:hAnsi="Times New Roman" w:cs="Times New Roman"/>
           <w:kern w:val="0"/>
           <w:lang w:bidi="th-TH"/>
           <w14:ligatures w14:val="none"/>
@@ -1717,7 +1565,6 @@
       <w:r>
         <w:rPr>
           <w:rFonts w:ascii="Times New Roman" w:eastAsia="Times New Roman" w:hAnsi="Times New Roman" w:cs="Times New Roman"/>
-          <w:color w:val="2E74B5" w:themeColor="accent5" w:themeShade="BF"/>
           <w:kern w:val="0"/>
           <w:lang w:bidi="th-TH"/>
           <w14:ligatures w14:val="none"/>
@@ -1728,7 +1575,6 @@
       <w:r>
         <w:rPr>
           <w:rFonts w:ascii="Times New Roman" w:eastAsia="Times New Roman" w:hAnsi="Times New Roman" w:cs="Times New Roman"/>
-          <w:color w:val="2E74B5" w:themeColor="accent5" w:themeShade="BF"/>
           <w:kern w:val="0"/>
           <w:lang w:bidi="th-TH"/>
           <w14:ligatures w14:val="none"/>
@@ -1739,18 +1585,16 @@
       <w:r>
         <w:rPr>
           <w:rFonts w:ascii="Times New Roman" w:eastAsia="Times New Roman" w:hAnsi="Times New Roman" w:cs="Times New Roman"/>
-          <w:color w:val="2E74B5" w:themeColor="accent5" w:themeShade="BF"/>
-          <w:kern w:val="0"/>
-          <w:lang w:bidi="th-TH"/>
-          <w14:ligatures w14:val="none"/>
-        </w:rPr>
-        <w:t xml:space="preserve"> </w:t>
-      </w:r>
-      <w:proofErr w:type="spellStart"/>
-      <w:r>
-        <w:rPr>
-          <w:rFonts w:ascii="Times New Roman" w:eastAsia="Times New Roman" w:hAnsi="Times New Roman" w:cs="Times New Roman"/>
-          <w:color w:val="2E74B5" w:themeColor="accent5" w:themeShade="BF"/>
+          <w:kern w:val="0"/>
+          <w:lang w:bidi="th-TH"/>
+          <w14:ligatures w14:val="none"/>
+        </w:rPr>
+        <w:t xml:space="preserve"> </w:t>
+      </w:r>
+      <w:proofErr w:type="spellStart"/>
+      <w:r>
+        <w:rPr>
+          <w:rFonts w:ascii="Times New Roman" w:eastAsia="Times New Roman" w:hAnsi="Times New Roman" w:cs="Times New Roman"/>
           <w:kern w:val="0"/>
           <w:lang w:bidi="th-TH"/>
           <w14:ligatures w14:val="none"/>
@@ -1761,18 +1605,16 @@
       <w:r>
         <w:rPr>
           <w:rFonts w:ascii="Times New Roman" w:eastAsia="Times New Roman" w:hAnsi="Times New Roman" w:cs="Times New Roman"/>
-          <w:color w:val="2E74B5" w:themeColor="accent5" w:themeShade="BF"/>
-          <w:kern w:val="0"/>
-          <w:lang w:bidi="th-TH"/>
-          <w14:ligatures w14:val="none"/>
-        </w:rPr>
-        <w:t xml:space="preserve"> </w:t>
-      </w:r>
-      <w:proofErr w:type="spellStart"/>
-      <w:r>
-        <w:rPr>
-          <w:rFonts w:ascii="Times New Roman" w:eastAsia="Times New Roman" w:hAnsi="Times New Roman" w:cs="Times New Roman"/>
-          <w:color w:val="2E74B5" w:themeColor="accent5" w:themeShade="BF"/>
+          <w:kern w:val="0"/>
+          <w:lang w:bidi="th-TH"/>
+          <w14:ligatures w14:val="none"/>
+        </w:rPr>
+        <w:t xml:space="preserve"> </w:t>
+      </w:r>
+      <w:proofErr w:type="spellStart"/>
+      <w:r>
+        <w:rPr>
+          <w:rFonts w:ascii="Times New Roman" w:eastAsia="Times New Roman" w:hAnsi="Times New Roman" w:cs="Times New Roman"/>
           <w:kern w:val="0"/>
           <w:lang w:bidi="th-TH"/>
           <w14:ligatures w14:val="none"/>
@@ -1783,7 +1625,6 @@
       <w:r>
         <w:rPr>
           <w:rFonts w:ascii="Times New Roman" w:eastAsia="Times New Roman" w:hAnsi="Times New Roman" w:cs="Times New Roman"/>
-          <w:color w:val="2E74B5" w:themeColor="accent5" w:themeShade="BF"/>
           <w:kern w:val="0"/>
           <w:lang w:bidi="th-TH"/>
           <w14:ligatures w14:val="none"/>
@@ -1794,7 +1635,6 @@
       <w:r>
         <w:rPr>
           <w:rFonts w:ascii="Times New Roman" w:eastAsia="Times New Roman" w:hAnsi="Times New Roman" w:cs="Times New Roman"/>
-          <w:color w:val="2E74B5" w:themeColor="accent5" w:themeShade="BF"/>
           <w:kern w:val="0"/>
           <w:lang w:bidi="th-TH"/>
           <w14:ligatures w14:val="none"/>
@@ -1805,18 +1645,16 @@
       <w:r>
         <w:rPr>
           <w:rFonts w:ascii="Times New Roman" w:eastAsia="Times New Roman" w:hAnsi="Times New Roman" w:cs="Times New Roman"/>
-          <w:color w:val="2E74B5" w:themeColor="accent5" w:themeShade="BF"/>
-          <w:kern w:val="0"/>
-          <w:lang w:bidi="th-TH"/>
-          <w14:ligatures w14:val="none"/>
-        </w:rPr>
-        <w:t xml:space="preserve"> </w:t>
-      </w:r>
-      <w:proofErr w:type="spellStart"/>
-      <w:r>
-        <w:rPr>
-          <w:rFonts w:ascii="Times New Roman" w:eastAsia="Times New Roman" w:hAnsi="Times New Roman" w:cs="Times New Roman"/>
-          <w:color w:val="2E74B5" w:themeColor="accent5" w:themeShade="BF"/>
+          <w:kern w:val="0"/>
+          <w:lang w:bidi="th-TH"/>
+          <w14:ligatures w14:val="none"/>
+        </w:rPr>
+        <w:t xml:space="preserve"> </w:t>
+      </w:r>
+      <w:proofErr w:type="spellStart"/>
+      <w:r>
+        <w:rPr>
+          <w:rFonts w:ascii="Times New Roman" w:eastAsia="Times New Roman" w:hAnsi="Times New Roman" w:cs="Times New Roman"/>
           <w:kern w:val="0"/>
           <w:lang w:bidi="th-TH"/>
           <w14:ligatures w14:val="none"/>
@@ -1827,18 +1665,16 @@
       <w:r>
         <w:rPr>
           <w:rFonts w:ascii="Times New Roman" w:eastAsia="Times New Roman" w:hAnsi="Times New Roman" w:cs="Times New Roman"/>
-          <w:color w:val="2E74B5" w:themeColor="accent5" w:themeShade="BF"/>
-          <w:kern w:val="0"/>
-          <w:lang w:bidi="th-TH"/>
-          <w14:ligatures w14:val="none"/>
-        </w:rPr>
-        <w:t xml:space="preserve"> </w:t>
-      </w:r>
-      <w:proofErr w:type="spellStart"/>
-      <w:r>
-        <w:rPr>
-          <w:rFonts w:ascii="Times New Roman" w:eastAsia="Times New Roman" w:hAnsi="Times New Roman" w:cs="Times New Roman"/>
-          <w:color w:val="2E74B5" w:themeColor="accent5" w:themeShade="BF"/>
+          <w:kern w:val="0"/>
+          <w:lang w:bidi="th-TH"/>
+          <w14:ligatures w14:val="none"/>
+        </w:rPr>
+        <w:t xml:space="preserve"> </w:t>
+      </w:r>
+      <w:proofErr w:type="spellStart"/>
+      <w:r>
+        <w:rPr>
+          <w:rFonts w:ascii="Times New Roman" w:eastAsia="Times New Roman" w:hAnsi="Times New Roman" w:cs="Times New Roman"/>
           <w:kern w:val="0"/>
           <w:lang w:bidi="th-TH"/>
           <w14:ligatures w14:val="none"/>
@@ -1849,18 +1685,16 @@
       <w:r>
         <w:rPr>
           <w:rFonts w:ascii="Times New Roman" w:eastAsia="Times New Roman" w:hAnsi="Times New Roman" w:cs="Times New Roman"/>
-          <w:color w:val="2E74B5" w:themeColor="accent5" w:themeShade="BF"/>
-          <w:kern w:val="0"/>
-          <w:lang w:bidi="th-TH"/>
-          <w14:ligatures w14:val="none"/>
-        </w:rPr>
-        <w:t xml:space="preserve"> </w:t>
-      </w:r>
-      <w:proofErr w:type="spellStart"/>
-      <w:r>
-        <w:rPr>
-          <w:rFonts w:ascii="Times New Roman" w:eastAsia="Times New Roman" w:hAnsi="Times New Roman" w:cs="Times New Roman"/>
-          <w:color w:val="2E74B5" w:themeColor="accent5" w:themeShade="BF"/>
+          <w:kern w:val="0"/>
+          <w:lang w:bidi="th-TH"/>
+          <w14:ligatures w14:val="none"/>
+        </w:rPr>
+        <w:t xml:space="preserve"> </w:t>
+      </w:r>
+      <w:proofErr w:type="spellStart"/>
+      <w:r>
+        <w:rPr>
+          <w:rFonts w:ascii="Times New Roman" w:eastAsia="Times New Roman" w:hAnsi="Times New Roman" w:cs="Times New Roman"/>
           <w:kern w:val="0"/>
           <w:lang w:bidi="th-TH"/>
           <w14:ligatures w14:val="none"/>
@@ -1871,18 +1705,16 @@
       <w:r>
         <w:rPr>
           <w:rFonts w:ascii="Times New Roman" w:eastAsia="Times New Roman" w:hAnsi="Times New Roman" w:cs="Times New Roman"/>
-          <w:color w:val="2E74B5" w:themeColor="accent5" w:themeShade="BF"/>
-          <w:kern w:val="0"/>
-          <w:lang w:bidi="th-TH"/>
-          <w14:ligatures w14:val="none"/>
-        </w:rPr>
-        <w:t xml:space="preserve"> </w:t>
-      </w:r>
-      <w:proofErr w:type="spellStart"/>
-      <w:r>
-        <w:rPr>
-          <w:rFonts w:ascii="Times New Roman" w:eastAsia="Times New Roman" w:hAnsi="Times New Roman" w:cs="Times New Roman"/>
-          <w:color w:val="2E74B5" w:themeColor="accent5" w:themeShade="BF"/>
+          <w:kern w:val="0"/>
+          <w:lang w:bidi="th-TH"/>
+          <w14:ligatures w14:val="none"/>
+        </w:rPr>
+        <w:t xml:space="preserve"> </w:t>
+      </w:r>
+      <w:proofErr w:type="spellStart"/>
+      <w:r>
+        <w:rPr>
+          <w:rFonts w:ascii="Times New Roman" w:eastAsia="Times New Roman" w:hAnsi="Times New Roman" w:cs="Times New Roman"/>
           <w:kern w:val="0"/>
           <w:lang w:bidi="th-TH"/>
           <w14:ligatures w14:val="none"/>
@@ -1893,7 +1725,6 @@
       <w:r>
         <w:rPr>
           <w:rFonts w:ascii="Times New Roman" w:eastAsia="Times New Roman" w:hAnsi="Times New Roman" w:cs="Times New Roman"/>
-          <w:color w:val="2E74B5" w:themeColor="accent5" w:themeShade="BF"/>
           <w:kern w:val="0"/>
           <w:lang w:bidi="th-TH"/>
           <w14:ligatures w14:val="none"/>
@@ -1904,7 +1735,6 @@
       <w:r>
         <w:rPr>
           <w:rFonts w:ascii="Times New Roman" w:eastAsia="Times New Roman" w:hAnsi="Times New Roman" w:cs="Times New Roman"/>
-          <w:color w:val="2E74B5" w:themeColor="accent5" w:themeShade="BF"/>
           <w:kern w:val="0"/>
           <w:lang w:bidi="th-TH"/>
           <w14:ligatures w14:val="none"/>
@@ -1915,7 +1745,6 @@
       <w:r>
         <w:rPr>
           <w:rFonts w:ascii="Times New Roman" w:eastAsia="Times New Roman" w:hAnsi="Times New Roman" w:cs="Times New Roman"/>
-          <w:color w:val="2E74B5" w:themeColor="accent5" w:themeShade="BF"/>
           <w:kern w:val="0"/>
           <w:lang w:bidi="th-TH"/>
           <w14:ligatures w14:val="none"/>
@@ -1926,7 +1755,6 @@
       <w:r>
         <w:rPr>
           <w:rFonts w:ascii="Times New Roman" w:eastAsia="Times New Roman" w:hAnsi="Times New Roman" w:cs="Times New Roman"/>
-          <w:color w:val="2E74B5" w:themeColor="accent5" w:themeShade="BF"/>
           <w:kern w:val="0"/>
           <w:lang w:bidi="th-TH"/>
           <w14:ligatures w14:val="none"/>
@@ -1937,18 +1765,16 @@
       <w:r>
         <w:rPr>
           <w:rFonts w:ascii="Times New Roman" w:eastAsia="Times New Roman" w:hAnsi="Times New Roman" w:cs="Times New Roman"/>
-          <w:color w:val="2E74B5" w:themeColor="accent5" w:themeShade="BF"/>
-          <w:kern w:val="0"/>
-          <w:lang w:bidi="th-TH"/>
-          <w14:ligatures w14:val="none"/>
-        </w:rPr>
-        <w:t xml:space="preserve"> </w:t>
-      </w:r>
-      <w:proofErr w:type="spellStart"/>
-      <w:r>
-        <w:rPr>
-          <w:rFonts w:ascii="Times New Roman" w:eastAsia="Times New Roman" w:hAnsi="Times New Roman" w:cs="Times New Roman"/>
-          <w:color w:val="2E74B5" w:themeColor="accent5" w:themeShade="BF"/>
+          <w:kern w:val="0"/>
+          <w:lang w:bidi="th-TH"/>
+          <w14:ligatures w14:val="none"/>
+        </w:rPr>
+        <w:t xml:space="preserve"> </w:t>
+      </w:r>
+      <w:proofErr w:type="spellStart"/>
+      <w:r>
+        <w:rPr>
+          <w:rFonts w:ascii="Times New Roman" w:eastAsia="Times New Roman" w:hAnsi="Times New Roman" w:cs="Times New Roman"/>
           <w:kern w:val="0"/>
           <w:lang w:bidi="th-TH"/>
           <w14:ligatures w14:val="none"/>
@@ -1959,18 +1785,16 @@
       <w:r>
         <w:rPr>
           <w:rFonts w:ascii="Times New Roman" w:eastAsia="Times New Roman" w:hAnsi="Times New Roman" w:cs="Times New Roman"/>
-          <w:color w:val="2E74B5" w:themeColor="accent5" w:themeShade="BF"/>
-          <w:kern w:val="0"/>
-          <w:lang w:bidi="th-TH"/>
-          <w14:ligatures w14:val="none"/>
-        </w:rPr>
-        <w:t xml:space="preserve"> </w:t>
-      </w:r>
-      <w:proofErr w:type="spellStart"/>
-      <w:r>
-        <w:rPr>
-          <w:rFonts w:ascii="Times New Roman" w:eastAsia="Times New Roman" w:hAnsi="Times New Roman" w:cs="Times New Roman"/>
-          <w:color w:val="2E74B5" w:themeColor="accent5" w:themeShade="BF"/>
+          <w:kern w:val="0"/>
+          <w:lang w:bidi="th-TH"/>
+          <w14:ligatures w14:val="none"/>
+        </w:rPr>
+        <w:t xml:space="preserve"> </w:t>
+      </w:r>
+      <w:proofErr w:type="spellStart"/>
+      <w:r>
+        <w:rPr>
+          <w:rFonts w:ascii="Times New Roman" w:eastAsia="Times New Roman" w:hAnsi="Times New Roman" w:cs="Times New Roman"/>
           <w:kern w:val="0"/>
           <w:bdr w:val="none" w:sz="0" w:space="0" w:color="auto" w:frame="1"/>
           <w:lang w:bidi="th-TH"/>
@@ -1982,7 +1806,6 @@
       <w:r>
         <w:rPr>
           <w:rFonts w:ascii="Times New Roman" w:eastAsia="Times New Roman" w:hAnsi="Times New Roman" w:cs="Times New Roman"/>
-          <w:color w:val="2E74B5" w:themeColor="accent5" w:themeShade="BF"/>
           <w:kern w:val="0"/>
           <w:lang w:bidi="th-TH"/>
           <w14:ligatures w14:val="none"/>
@@ -1993,7 +1816,6 @@
       <w:r>
         <w:rPr>
           <w:rFonts w:ascii="Times New Roman" w:eastAsia="Times New Roman" w:hAnsi="Times New Roman" w:cs="Times New Roman"/>
-          <w:color w:val="2E74B5" w:themeColor="accent5" w:themeShade="BF"/>
           <w:kern w:val="0"/>
           <w:lang w:bidi="th-TH"/>
           <w14:ligatures w14:val="none"/>
@@ -2004,18 +1826,16 @@
       <w:r>
         <w:rPr>
           <w:rFonts w:ascii="Times New Roman" w:eastAsia="Times New Roman" w:hAnsi="Times New Roman" w:cs="Times New Roman"/>
-          <w:color w:val="2E74B5" w:themeColor="accent5" w:themeShade="BF"/>
-          <w:kern w:val="0"/>
-          <w:lang w:bidi="th-TH"/>
-          <w14:ligatures w14:val="none"/>
-        </w:rPr>
-        <w:t xml:space="preserve"> </w:t>
-      </w:r>
-      <w:proofErr w:type="spellStart"/>
-      <w:r>
-        <w:rPr>
-          <w:rFonts w:ascii="Times New Roman" w:eastAsia="Times New Roman" w:hAnsi="Times New Roman" w:cs="Times New Roman"/>
-          <w:color w:val="2E74B5" w:themeColor="accent5" w:themeShade="BF"/>
+          <w:kern w:val="0"/>
+          <w:lang w:bidi="th-TH"/>
+          <w14:ligatures w14:val="none"/>
+        </w:rPr>
+        <w:t xml:space="preserve"> </w:t>
+      </w:r>
+      <w:proofErr w:type="spellStart"/>
+      <w:r>
+        <w:rPr>
+          <w:rFonts w:ascii="Times New Roman" w:eastAsia="Times New Roman" w:hAnsi="Times New Roman" w:cs="Times New Roman"/>
           <w:kern w:val="0"/>
           <w:lang w:bidi="th-TH"/>
           <w14:ligatures w14:val="none"/>
@@ -2026,18 +1846,16 @@
       <w:r>
         <w:rPr>
           <w:rFonts w:ascii="Times New Roman" w:eastAsia="Times New Roman" w:hAnsi="Times New Roman" w:cs="Times New Roman"/>
-          <w:color w:val="2E74B5" w:themeColor="accent5" w:themeShade="BF"/>
-          <w:kern w:val="0"/>
-          <w:lang w:bidi="th-TH"/>
-          <w14:ligatures w14:val="none"/>
-        </w:rPr>
-        <w:t xml:space="preserve"> </w:t>
-      </w:r>
-      <w:proofErr w:type="spellStart"/>
-      <w:r>
-        <w:rPr>
-          <w:rFonts w:ascii="Times New Roman" w:eastAsia="Times New Roman" w:hAnsi="Times New Roman" w:cs="Times New Roman"/>
-          <w:color w:val="2E74B5" w:themeColor="accent5" w:themeShade="BF"/>
+          <w:kern w:val="0"/>
+          <w:lang w:bidi="th-TH"/>
+          <w14:ligatures w14:val="none"/>
+        </w:rPr>
+        <w:t xml:space="preserve"> </w:t>
+      </w:r>
+      <w:proofErr w:type="spellStart"/>
+      <w:r>
+        <w:rPr>
+          <w:rFonts w:ascii="Times New Roman" w:eastAsia="Times New Roman" w:hAnsi="Times New Roman" w:cs="Times New Roman"/>
           <w:kern w:val="0"/>
           <w:lang w:bidi="th-TH"/>
           <w14:ligatures w14:val="none"/>
@@ -2048,7 +1866,6 @@
       <w:r>
         <w:rPr>
           <w:rFonts w:ascii="Times New Roman" w:eastAsia="Times New Roman" w:hAnsi="Times New Roman" w:cs="Times New Roman"/>
-          <w:color w:val="2E74B5" w:themeColor="accent5" w:themeShade="BF"/>
           <w:kern w:val="0"/>
           <w:lang w:bidi="th-TH"/>
           <w14:ligatures w14:val="none"/>
@@ -2059,7 +1876,6 @@
       <w:r>
         <w:rPr>
           <w:rFonts w:ascii="Times New Roman" w:eastAsia="Times New Roman" w:hAnsi="Times New Roman" w:cs="Times New Roman"/>
-          <w:color w:val="2E74B5" w:themeColor="accent5" w:themeShade="BF"/>
           <w:kern w:val="0"/>
           <w:lang w:bidi="th-TH"/>
           <w14:ligatures w14:val="none"/>
@@ -2070,7 +1886,6 @@
       <w:r>
         <w:rPr>
           <w:rFonts w:ascii="Times New Roman" w:eastAsia="Times New Roman" w:hAnsi="Times New Roman" w:cs="Times New Roman"/>
-          <w:color w:val="2E74B5" w:themeColor="accent5" w:themeShade="BF"/>
           <w:kern w:val="0"/>
           <w:lang w:bidi="th-TH"/>
           <w14:ligatures w14:val="none"/>

</xml_diff>